<commit_message>
Added new content from recent stream.
</commit_message>
<xml_diff>
--- a/_Projects/P1012202501-ESP32_Stepper_Controller/ProjectDocuments/P1012202501-1 Revision 2 Test Plan.docx
+++ b/_Projects/P1012202501-ESP32_Stepper_Controller/ProjectDocuments/P1012202501-1 Revision 2 Test Plan.docx
@@ -7,7 +7,7 @@
         <w:pStyle w:val="BodyText"/>
         <w:bidi w:val="0"/>
         <w:spacing w:lineRule="auto" w:line="276" w:before="0" w:after="140"/>
-        <w:jc w:val="start"/>
+        <w:jc w:val="left"/>
         <w:rPr/>
       </w:pPr>
       <w:r>
@@ -17,14 +17,14 @@
     <w:tbl>
       <w:tblPr>
         <w:tblW w:w="5000" w:type="pct"/>
-        <w:jc w:val="start"/>
+        <w:jc w:val="left"/>
         <w:tblInd w:w="55" w:type="dxa"/>
         <w:tblLayout w:type="fixed"/>
         <w:tblCellMar>
           <w:top w:w="55" w:type="dxa"/>
-          <w:start w:w="55" w:type="dxa"/>
+          <w:left w:w="55" w:type="dxa"/>
           <w:bottom w:w="55" w:type="dxa"/>
-          <w:end w:w="55" w:type="dxa"/>
+          <w:right w:w="55" w:type="dxa"/>
         </w:tblCellMar>
       </w:tblPr>
       <w:tblGrid>
@@ -39,7 +39,7 @@
             <w:tcW w:w="3324" w:type="dxa"/>
             <w:tcBorders>
               <w:top w:val="single" w:sz="4" w:space="0" w:color="000000"/>
-              <w:start w:val="single" w:sz="4" w:space="0" w:color="000000"/>
+              <w:left w:val="single" w:sz="4" w:space="0" w:color="000000"/>
               <w:bottom w:val="single" w:sz="4" w:space="0" w:color="000000"/>
             </w:tcBorders>
           </w:tcPr>
@@ -47,7 +47,7 @@
             <w:pPr>
               <w:pStyle w:val="TableContents"/>
               <w:bidi w:val="0"/>
-              <w:jc w:val="start"/>
+              <w:jc w:val="left"/>
               <w:rPr>
                 <w:rFonts w:ascii="Liberation Serif" w:hAnsi="Liberation Serif"/>
                 <w:b w:val="false"/>
@@ -89,7 +89,7 @@
             <w:tcW w:w="3324" w:type="dxa"/>
             <w:tcBorders>
               <w:top w:val="single" w:sz="4" w:space="0" w:color="000000"/>
-              <w:start w:val="single" w:sz="4" w:space="0" w:color="000000"/>
+              <w:left w:val="single" w:sz="4" w:space="0" w:color="000000"/>
               <w:bottom w:val="single" w:sz="4" w:space="0" w:color="000000"/>
             </w:tcBorders>
           </w:tcPr>
@@ -97,7 +97,7 @@
             <w:pPr>
               <w:pStyle w:val="TableContents"/>
               <w:bidi w:val="0"/>
-              <w:jc w:val="start"/>
+              <w:jc w:val="left"/>
               <w:rPr>
                 <w:rFonts w:ascii="Liberation Serif" w:hAnsi="Liberation Serif"/>
                 <w:b w:val="false"/>
@@ -139,16 +139,16 @@
             <w:tcW w:w="3324" w:type="dxa"/>
             <w:tcBorders>
               <w:top w:val="single" w:sz="4" w:space="0" w:color="000000"/>
-              <w:start w:val="single" w:sz="4" w:space="0" w:color="000000"/>
+              <w:left w:val="single" w:sz="4" w:space="0" w:color="000000"/>
               <w:bottom w:val="single" w:sz="4" w:space="0" w:color="000000"/>
-              <w:end w:val="single" w:sz="4" w:space="0" w:color="000000"/>
+              <w:right w:val="single" w:sz="4" w:space="0" w:color="000000"/>
             </w:tcBorders>
           </w:tcPr>
           <w:p>
             <w:pPr>
               <w:pStyle w:val="TableContents"/>
               <w:bidi w:val="0"/>
-              <w:jc w:val="start"/>
+              <w:jc w:val="left"/>
               <w:rPr>
                 <w:rFonts w:ascii="Liberation Serif" w:hAnsi="Liberation Serif"/>
                 <w:b w:val="false"/>
@@ -194,7 +194,7 @@
           <w:tcPr>
             <w:tcW w:w="3324" w:type="dxa"/>
             <w:tcBorders>
-              <w:start w:val="single" w:sz="4" w:space="0" w:color="000000"/>
+              <w:left w:val="single" w:sz="4" w:space="0" w:color="000000"/>
               <w:bottom w:val="single" w:sz="4" w:space="0" w:color="000000"/>
             </w:tcBorders>
           </w:tcPr>
@@ -202,7 +202,7 @@
             <w:pPr>
               <w:pStyle w:val="TableContents"/>
               <w:bidi w:val="0"/>
-              <w:jc w:val="start"/>
+              <w:jc w:val="left"/>
               <w:rPr>
                 <w:rFonts w:ascii="Liberation Serif" w:hAnsi="Liberation Serif"/>
                 <w:b w:val="false"/>
@@ -243,7 +243,7 @@
           <w:tcPr>
             <w:tcW w:w="3324" w:type="dxa"/>
             <w:tcBorders>
-              <w:start w:val="single" w:sz="4" w:space="0" w:color="000000"/>
+              <w:left w:val="single" w:sz="4" w:space="0" w:color="000000"/>
               <w:bottom w:val="single" w:sz="4" w:space="0" w:color="000000"/>
             </w:tcBorders>
           </w:tcPr>
@@ -251,7 +251,7 @@
             <w:pPr>
               <w:pStyle w:val="TableContents"/>
               <w:bidi w:val="0"/>
-              <w:jc w:val="start"/>
+              <w:jc w:val="left"/>
               <w:rPr>
                 <w:rFonts w:ascii="Liberation Serif" w:hAnsi="Liberation Serif"/>
                 <w:b w:val="false"/>
@@ -292,16 +292,16 @@
           <w:tcPr>
             <w:tcW w:w="3324" w:type="dxa"/>
             <w:tcBorders>
-              <w:start w:val="single" w:sz="4" w:space="0" w:color="000000"/>
+              <w:left w:val="single" w:sz="4" w:space="0" w:color="000000"/>
               <w:bottom w:val="single" w:sz="4" w:space="0" w:color="000000"/>
-              <w:end w:val="single" w:sz="4" w:space="0" w:color="000000"/>
+              <w:right w:val="single" w:sz="4" w:space="0" w:color="000000"/>
             </w:tcBorders>
           </w:tcPr>
           <w:p>
             <w:pPr>
               <w:pStyle w:val="TableContents"/>
               <w:bidi w:val="0"/>
-              <w:jc w:val="start"/>
+              <w:jc w:val="left"/>
               <w:rPr>
                 <w:rFonts w:ascii="Liberation Serif" w:hAnsi="Liberation Serif"/>
                 <w:b w:val="false"/>
@@ -347,7 +347,7 @@
           <w:tcPr>
             <w:tcW w:w="3324" w:type="dxa"/>
             <w:tcBorders>
-              <w:start w:val="single" w:sz="4" w:space="0" w:color="000000"/>
+              <w:left w:val="single" w:sz="4" w:space="0" w:color="000000"/>
               <w:bottom w:val="single" w:sz="4" w:space="0" w:color="000000"/>
             </w:tcBorders>
           </w:tcPr>
@@ -355,7 +355,7 @@
             <w:pPr>
               <w:pStyle w:val="TableContents"/>
               <w:bidi w:val="0"/>
-              <w:jc w:val="start"/>
+              <w:jc w:val="left"/>
               <w:rPr>
                 <w:rFonts w:ascii="Liberation Serif" w:hAnsi="Liberation Serif"/>
                 <w:b w:val="false"/>
@@ -396,7 +396,7 @@
           <w:tcPr>
             <w:tcW w:w="3324" w:type="dxa"/>
             <w:tcBorders>
-              <w:start w:val="single" w:sz="4" w:space="0" w:color="000000"/>
+              <w:left w:val="single" w:sz="4" w:space="0" w:color="000000"/>
               <w:bottom w:val="single" w:sz="4" w:space="0" w:color="000000"/>
             </w:tcBorders>
           </w:tcPr>
@@ -404,7 +404,7 @@
             <w:pPr>
               <w:pStyle w:val="TableContents"/>
               <w:bidi w:val="0"/>
-              <w:jc w:val="start"/>
+              <w:jc w:val="left"/>
               <w:rPr>
                 <w:rFonts w:ascii="Liberation Serif" w:hAnsi="Liberation Serif"/>
                 <w:b w:val="false"/>
@@ -444,16 +444,16 @@
           <w:tcPr>
             <w:tcW w:w="3324" w:type="dxa"/>
             <w:tcBorders>
-              <w:start w:val="single" w:sz="4" w:space="0" w:color="000000"/>
+              <w:left w:val="single" w:sz="4" w:space="0" w:color="000000"/>
               <w:bottom w:val="single" w:sz="4" w:space="0" w:color="000000"/>
-              <w:end w:val="single" w:sz="4" w:space="0" w:color="000000"/>
+              <w:right w:val="single" w:sz="4" w:space="0" w:color="000000"/>
             </w:tcBorders>
           </w:tcPr>
           <w:p>
             <w:pPr>
               <w:pStyle w:val="TableContents"/>
               <w:bidi w:val="0"/>
-              <w:jc w:val="start"/>
+              <w:jc w:val="left"/>
               <w:rPr>
                 <w:rFonts w:ascii="Liberation Serif" w:hAnsi="Liberation Serif"/>
                 <w:b w:val="false"/>
@@ -498,7 +498,7 @@
           <w:tcPr>
             <w:tcW w:w="3324" w:type="dxa"/>
             <w:tcBorders>
-              <w:start w:val="single" w:sz="4" w:space="0" w:color="000000"/>
+              <w:left w:val="single" w:sz="4" w:space="0" w:color="000000"/>
               <w:bottom w:val="single" w:sz="4" w:space="0" w:color="000000"/>
             </w:tcBorders>
           </w:tcPr>
@@ -506,7 +506,7 @@
             <w:pPr>
               <w:pStyle w:val="TableContents"/>
               <w:bidi w:val="0"/>
-              <w:jc w:val="start"/>
+              <w:jc w:val="left"/>
               <w:rPr>
                 <w:rFonts w:ascii="Liberation Serif" w:hAnsi="Liberation Serif"/>
                 <w:b w:val="false"/>
@@ -547,7 +547,7 @@
           <w:tcPr>
             <w:tcW w:w="3324" w:type="dxa"/>
             <w:tcBorders>
-              <w:start w:val="single" w:sz="4" w:space="0" w:color="000000"/>
+              <w:left w:val="single" w:sz="4" w:space="0" w:color="000000"/>
               <w:bottom w:val="single" w:sz="4" w:space="0" w:color="000000"/>
             </w:tcBorders>
           </w:tcPr>
@@ -555,7 +555,7 @@
             <w:pPr>
               <w:pStyle w:val="TableContents"/>
               <w:bidi w:val="0"/>
-              <w:jc w:val="start"/>
+              <w:jc w:val="left"/>
               <w:rPr>
                 <w:rFonts w:ascii="Liberation Serif" w:hAnsi="Liberation Serif"/>
                 <w:b w:val="false"/>
@@ -595,16 +595,16 @@
           <w:tcPr>
             <w:tcW w:w="3324" w:type="dxa"/>
             <w:tcBorders>
-              <w:start w:val="single" w:sz="4" w:space="0" w:color="000000"/>
+              <w:left w:val="single" w:sz="4" w:space="0" w:color="000000"/>
               <w:bottom w:val="single" w:sz="4" w:space="0" w:color="000000"/>
-              <w:end w:val="single" w:sz="4" w:space="0" w:color="000000"/>
+              <w:right w:val="single" w:sz="4" w:space="0" w:color="000000"/>
             </w:tcBorders>
           </w:tcPr>
           <w:p>
             <w:pPr>
               <w:pStyle w:val="TableContents"/>
               <w:bidi w:val="0"/>
-              <w:jc w:val="start"/>
+              <w:jc w:val="left"/>
               <w:rPr>
                 <w:rFonts w:ascii="Liberation Serif" w:hAnsi="Liberation Serif"/>
                 <w:b w:val="false"/>
@@ -647,7 +647,7 @@
         <w:pStyle w:val="BodyText"/>
         <w:bidi w:val="0"/>
         <w:spacing w:lineRule="auto" w:line="276" w:before="0" w:after="140"/>
-        <w:jc w:val="start"/>
+        <w:jc w:val="left"/>
         <w:rPr/>
       </w:pPr>
       <w:r>
@@ -657,14 +657,14 @@
     <w:tbl>
       <w:tblPr>
         <w:tblW w:w="9975" w:type="dxa"/>
-        <w:jc w:val="start"/>
+        <w:jc w:val="left"/>
         <w:tblInd w:w="0" w:type="dxa"/>
         <w:tblLayout w:type="fixed"/>
         <w:tblCellMar>
           <w:top w:w="0" w:type="dxa"/>
-          <w:start w:w="0" w:type="dxa"/>
+          <w:left w:w="0" w:type="dxa"/>
           <w:bottom w:w="0" w:type="dxa"/>
-          <w:end w:w="0" w:type="dxa"/>
+          <w:right w:w="0" w:type="dxa"/>
         </w:tblCellMar>
       </w:tblPr>
       <w:tblGrid>
@@ -683,7 +683,7 @@
             <w:pPr>
               <w:pStyle w:val="TableContents"/>
               <w:bidi w:val="0"/>
-              <w:jc w:val="start"/>
+              <w:jc w:val="left"/>
               <w:rPr/>
             </w:pPr>
             <w:r>
@@ -701,7 +701,7 @@
             <w:pPr>
               <w:pStyle w:val="TableContents"/>
               <w:bidi w:val="0"/>
-              <w:jc w:val="start"/>
+              <w:jc w:val="left"/>
               <w:rPr/>
             </w:pPr>
             <w:r>
@@ -719,7 +719,7 @@
             <w:pPr>
               <w:pStyle w:val="TableContents"/>
               <w:bidi w:val="0"/>
-              <w:jc w:val="start"/>
+              <w:jc w:val="left"/>
               <w:rPr/>
             </w:pPr>
             <w:r>
@@ -742,7 +742,7 @@
               <w:widowControl w:val="false"/>
               <w:suppressLineNumbers/>
               <w:bidi w:val="0"/>
-              <w:jc w:val="start"/>
+              <w:jc w:val="left"/>
               <w:rPr/>
             </w:pPr>
             <w:r>
@@ -761,7 +761,7 @@
               <w:widowControl w:val="false"/>
               <w:suppressLineNumbers/>
               <w:bidi w:val="0"/>
-              <w:jc w:val="start"/>
+              <w:jc w:val="left"/>
               <w:rPr/>
             </w:pPr>
             <w:r>
@@ -780,7 +780,7 @@
               <w:widowControl w:val="false"/>
               <w:suppressLineNumbers/>
               <w:bidi w:val="0"/>
-              <w:jc w:val="start"/>
+              <w:jc w:val="left"/>
               <w:rPr/>
             </w:pPr>
             <w:r>
@@ -802,7 +802,7 @@
               <w:widowControl w:val="false"/>
               <w:suppressLineNumbers/>
               <w:bidi w:val="0"/>
-              <w:jc w:val="start"/>
+              <w:jc w:val="left"/>
               <w:rPr/>
             </w:pPr>
             <w:r>
@@ -821,7 +821,7 @@
               <w:widowControl w:val="false"/>
               <w:suppressLineNumbers/>
               <w:bidi w:val="0"/>
-              <w:jc w:val="start"/>
+              <w:jc w:val="left"/>
               <w:rPr/>
             </w:pPr>
             <w:r>
@@ -840,7 +840,7 @@
               <w:widowControl w:val="false"/>
               <w:suppressLineNumbers/>
               <w:bidi w:val="0"/>
-              <w:jc w:val="start"/>
+              <w:jc w:val="left"/>
               <w:rPr/>
             </w:pPr>
             <w:r>
@@ -862,7 +862,7 @@
               <w:widowControl w:val="false"/>
               <w:suppressLineNumbers/>
               <w:bidi w:val="0"/>
-              <w:jc w:val="start"/>
+              <w:jc w:val="left"/>
               <w:rPr/>
             </w:pPr>
             <w:r>
@@ -881,7 +881,7 @@
               <w:widowControl w:val="false"/>
               <w:suppressLineNumbers/>
               <w:bidi w:val="0"/>
-              <w:jc w:val="start"/>
+              <w:jc w:val="left"/>
               <w:rPr/>
             </w:pPr>
             <w:r>
@@ -900,7 +900,7 @@
               <w:widowControl w:val="false"/>
               <w:suppressLineNumbers/>
               <w:bidi w:val="0"/>
-              <w:jc w:val="start"/>
+              <w:jc w:val="left"/>
               <w:rPr/>
             </w:pPr>
             <w:r>
@@ -914,7 +914,7 @@
       <w:pPr>
         <w:pStyle w:val="Normal"/>
         <w:bidi w:val="0"/>
-        <w:jc w:val="start"/>
+        <w:jc w:val="left"/>
         <w:rPr/>
       </w:pPr>
       <w:r>
@@ -1002,7 +1002,25 @@
           <w:szCs w:val="24"/>
         </w:rPr>
         <w:tab/>
-        <w:t>The scope of this document is limited to the “xxxxxxxx project” only.</w:t>
+        <w:t xml:space="preserve">The scope of this document is limited to </w:t>
+      </w:r>
+      <w:r>
+        <w:rPr>
+          <w:b w:val="false"/>
+          <w:bCs w:val="false"/>
+          <w:sz w:val="24"/>
+          <w:szCs w:val="24"/>
+        </w:rPr>
+        <w:t>project # P1012202501 ESP32 Stepper Motor Controller</w:t>
+      </w:r>
+      <w:r>
+        <w:rPr>
+          <w:b w:val="false"/>
+          <w:bCs w:val="false"/>
+          <w:sz w:val="24"/>
+          <w:szCs w:val="24"/>
+        </w:rPr>
+        <w:t xml:space="preserve"> only.</w:t>
       </w:r>
     </w:p>
     <w:p>
@@ -1064,11 +1082,7 @@
       </w:pPr>
       <w:r>
         <w:rPr/>
-        <w:t>“</w:t>
-      </w:r>
-      <w:r>
-        <w:rPr/>
-        <w:t>Enter test plan log file here”</w:t>
+        <w:t>Current version copy of “QA-0002-Test Plan Log Template.xlsx”</w:t>
       </w:r>
     </w:p>
     <w:p>
@@ -1096,11 +1110,21 @@
       </w:pPr>
       <w:r>
         <w:rPr/>
-        <w:t>“</w:t>
-      </w:r>
-      <w:r>
-        <w:rPr/>
-        <w:t>Enter additional items as necessary”</w:t>
+        <w:t>Digital handheld multi-meter capable of measuring voltage and resistance</w:t>
+      </w:r>
+    </w:p>
+    <w:p>
+      <w:pPr>
+        <w:pStyle w:val="BodyText"/>
+        <w:numPr>
+          <w:ilvl w:val="0"/>
+          <w:numId w:val="2"/>
+        </w:numPr>
+        <w:rPr/>
+      </w:pPr>
+      <w:r>
+        <w:rPr/>
+        <w:t>Bench top power supply that has a current limiting feature</w:t>
       </w:r>
     </w:p>
     <w:p>
@@ -1131,7 +1155,25 @@
       <w:r>
         <w:rPr/>
         <w:tab/>
-        <w:t>Take note of anything that is out of order with the PCB assembly or the additional materials for the testing process. If at anytime testing has a failure condition, please stop the test and investigate/repair the issue. Continue the testing after any failure condition has been remedied and take notes on the issue and what was necessary to resolve it. If the issue cannot be resolved, stop the testing and elevate to direct supervisor for next steps.</w:t>
+      </w:r>
+      <w:r>
+        <w:rPr/>
+        <w:t>Copy the “QA-0002-Test Plan Log Template.xlsx” to the `Project Directory/ProjectDocuments/test-logs` and rename it to “P1012202501-2 Revision 2 Test Log.xlsx”. Edit the “P1012202501-2 Revision 2 Test Log.xlsx” file and fill in the appropriate project related information in the top right section of the form and save the file. Duplicate the sheet and rename the new sheet to the serial number of the PCB being tested. Duplicate and rename the sheet for all PCB assemblies involved in the testing.</w:t>
+      </w:r>
+    </w:p>
+    <w:p>
+      <w:pPr>
+        <w:pStyle w:val="BodyText"/>
+        <w:rPr/>
+      </w:pPr>
+      <w:r>
+        <w:rPr/>
+        <w:tab/>
+        <w:t xml:space="preserve"> </w:t>
+      </w:r>
+      <w:r>
+        <w:rPr/>
+        <w:t>If at anytime testing has a failure condition, please stop the test and investigate/repair the issue. Continue the testing after any failure condition has been remedied and take notes on the issue and what was necessary to resolve it. If the issue cannot be resolved, stop the testing and elevate to direct supervisor for next steps.</w:t>
       </w:r>
     </w:p>
     <w:p>
@@ -1160,81 +1202,142 @@
           <w:sz w:val="32"/>
           <w:szCs w:val="32"/>
         </w:rPr>
-        <w:t>Test Section 1 – Visual Inspection</w:t>
-      </w:r>
-    </w:p>
-    <w:p>
-      <w:pPr>
-        <w:pStyle w:val="BodyText"/>
-        <w:rPr/>
-      </w:pPr>
-      <w:r>
-        <w:rPr/>
-        <w:tab/>
-        <w:t>This section is to help visually identify assembly defects that could cause undesired operation.</w:t>
-      </w:r>
-    </w:p>
-    <w:p>
-      <w:pPr>
-        <w:pStyle w:val="BodyText"/>
-        <w:rPr/>
-      </w:pPr>
-      <w:r>
-        <w:rPr/>
-        <w:t>TS1-0001:</w:t>
-      </w:r>
-    </w:p>
-    <w:p>
-      <w:pPr>
-        <w:pStyle w:val="BodyText"/>
-        <w:rPr/>
-      </w:pPr>
-      <w:r>
-        <w:rPr/>
-        <w:tab/>
-        <w:t>Visually inspect the PCB assembly for any workmanship defects such as poor soldering or off-pad components following the applicable IPC criteria outlined in the project design documentation. Enter the results into the log file associated with the project.</w:t>
-      </w:r>
-    </w:p>
-    <w:p>
-      <w:pPr>
-        <w:pStyle w:val="BodyText"/>
-        <w:rPr/>
-      </w:pPr>
-      <w:r>
-        <w:rPr/>
-        <w:t>“</w:t>
-      </w:r>
-      <w:r>
-        <w:rPr/>
-        <w:t>ADD MORE TESTING THAT MAY BE APPROPRIATE AT THIS STAGE HERE”</w:t>
-      </w:r>
-    </w:p>
-    <w:p>
-      <w:pPr>
-        <w:pStyle w:val="BodyText"/>
-        <w:rPr/>
-      </w:pPr>
-      <w:r>
-        <w:rPr/>
-      </w:r>
-    </w:p>
-    <w:p>
-      <w:pPr>
-        <w:pStyle w:val="Heading"/>
+        <w:t xml:space="preserve">Functional Requirements Defined by the </w:t>
+      </w:r>
+      <w:r>
         <w:rPr>
           <w:b/>
           <w:bCs/>
           <w:sz w:val="32"/>
           <w:szCs w:val="32"/>
         </w:rPr>
-      </w:pPr>
-      <w:r>
+        <w:t>PRD</w:t>
+      </w:r>
+    </w:p>
+    <w:p>
+      <w:pPr>
+        <w:pStyle w:val="BodyText"/>
         <w:rPr>
           <w:b/>
           <w:bCs/>
           <w:sz w:val="32"/>
           <w:szCs w:val="32"/>
         </w:rPr>
+      </w:pPr>
+      <w:r>
+        <w:rPr>
+          <w:b/>
+          <w:bCs/>
+          <w:sz w:val="32"/>
+          <w:szCs w:val="32"/>
+        </w:rPr>
+        <w:tab/>
+      </w:r>
+      <w:r>
+        <w:rPr>
+          <w:b w:val="false"/>
+          <w:bCs w:val="false"/>
+          <w:sz w:val="24"/>
+          <w:szCs w:val="24"/>
+        </w:rPr>
+        <w:t>These are visual confirmation items only.</w:t>
+      </w:r>
+    </w:p>
+    <w:p>
+      <w:pPr>
+        <w:pStyle w:val="BodyText"/>
+        <w:rPr/>
+      </w:pPr>
+      <w:r>
+        <w:rPr/>
+      </w:r>
+    </w:p>
+    <w:p>
+      <w:pPr>
+        <w:pStyle w:val="Heading"/>
+        <w:rPr>
+          <w:b/>
+          <w:bCs/>
+          <w:sz w:val="32"/>
+          <w:szCs w:val="32"/>
+        </w:rPr>
+      </w:pPr>
+      <w:r>
+        <w:rPr>
+          <w:b/>
+          <w:bCs/>
+          <w:sz w:val="32"/>
+          <w:szCs w:val="32"/>
+        </w:rPr>
+        <w:t>Test Section 1 – Visual Inspection</w:t>
+      </w:r>
+    </w:p>
+    <w:p>
+      <w:pPr>
+        <w:pStyle w:val="BodyText"/>
+        <w:rPr/>
+      </w:pPr>
+      <w:r>
+        <w:rPr/>
+        <w:tab/>
+        <w:t>This section is to help visually identify assembly defects that could cause undesired operation.</w:t>
+      </w:r>
+    </w:p>
+    <w:p>
+      <w:pPr>
+        <w:pStyle w:val="BodyText"/>
+        <w:rPr/>
+      </w:pPr>
+      <w:r>
+        <w:rPr/>
+        <w:t>TS1-0001:</w:t>
+      </w:r>
+    </w:p>
+    <w:p>
+      <w:pPr>
+        <w:pStyle w:val="BodyText"/>
+        <w:rPr/>
+      </w:pPr>
+      <w:r>
+        <w:rPr/>
+        <w:tab/>
+        <w:t xml:space="preserve">Visually inspect the PCB assembly for any workmanship defects such as poor soldering or off-pad components following </w:t>
+      </w:r>
+      <w:r>
+        <w:rPr/>
+        <w:t>IPC-A-610 Class II assembly standards</w:t>
+      </w:r>
+      <w:r>
+        <w:rPr/>
+        <w:t>. Enter the results into the log file associated with the project.</w:t>
+      </w:r>
+    </w:p>
+    <w:p>
+      <w:pPr>
+        <w:pStyle w:val="BodyText"/>
+        <w:rPr/>
+      </w:pPr>
+      <w:r>
+        <w:rPr/>
+      </w:r>
+    </w:p>
+    <w:p>
+      <w:pPr>
+        <w:pStyle w:val="Heading"/>
+        <w:rPr>
+          <w:b/>
+          <w:bCs/>
+          <w:sz w:val="32"/>
+          <w:szCs w:val="32"/>
+        </w:rPr>
+      </w:pPr>
+      <w:r>
+        <w:rPr>
+          <w:b/>
+          <w:bCs/>
+          <w:sz w:val="32"/>
+          <w:szCs w:val="32"/>
+        </w:rPr>
         <w:t>Test Section 2 – Prior to Power up</w:t>
       </w:r>
     </w:p>
@@ -1273,8 +1376,8 @@
         <w:rPr>
           <w:b w:val="false"/>
           <w:bCs w:val="false"/>
-          <w:sz w:val="24"/>
-          <w:szCs w:val="24"/>
+          <w:sz w:val="28"/>
+          <w:szCs w:val="28"/>
         </w:rPr>
       </w:pPr>
       <w:r>
@@ -1285,6 +1388,210 @@
           <w:szCs w:val="24"/>
         </w:rPr>
         <w:t>TS2-0001:</w:t>
+      </w:r>
+    </w:p>
+    <w:p>
+      <w:pPr>
+        <w:pStyle w:val="BodyText"/>
+        <w:rPr>
+          <w:b w:val="false"/>
+          <w:bCs w:val="false"/>
+          <w:sz w:val="28"/>
+          <w:szCs w:val="28"/>
+        </w:rPr>
+      </w:pPr>
+      <w:r>
+        <w:rPr>
+          <w:b w:val="false"/>
+          <w:bCs w:val="false"/>
+          <w:sz w:val="24"/>
+          <w:szCs w:val="24"/>
+        </w:rPr>
+        <w:tab/>
+        <w:t>Using the multi-meter in resistance mode, check between TP1 (+3.3V) and TP3 (GND) and verify that the resistance is greater than 5KΩ.</w:t>
+      </w:r>
+    </w:p>
+    <w:p>
+      <w:pPr>
+        <w:pStyle w:val="BodyText"/>
+        <w:rPr>
+          <w:b w:val="false"/>
+          <w:bCs w:val="false"/>
+          <w:sz w:val="28"/>
+          <w:szCs w:val="28"/>
+        </w:rPr>
+      </w:pPr>
+      <w:r>
+        <w:rPr>
+          <w:b w:val="false"/>
+          <w:bCs w:val="false"/>
+          <w:sz w:val="24"/>
+          <w:szCs w:val="24"/>
+        </w:rPr>
+        <w:t>TS2-0002:</w:t>
+      </w:r>
+    </w:p>
+    <w:p>
+      <w:pPr>
+        <w:pStyle w:val="BodyText"/>
+        <w:rPr>
+          <w:b w:val="false"/>
+          <w:bCs w:val="false"/>
+          <w:sz w:val="28"/>
+          <w:szCs w:val="28"/>
+        </w:rPr>
+      </w:pPr>
+      <w:r>
+        <w:rPr>
+          <w:b w:val="false"/>
+          <w:bCs w:val="false"/>
+          <w:sz w:val="24"/>
+          <w:szCs w:val="24"/>
+        </w:rPr>
+        <w:tab/>
+        <w:t>Using the multi-meter in resistance mode, check between TP2 (+5.0V) and TP3 (GND) and verify that the resistance is greater than 5KΩ.</w:t>
+      </w:r>
+    </w:p>
+    <w:p>
+      <w:pPr>
+        <w:pStyle w:val="BodyText"/>
+        <w:rPr>
+          <w:b w:val="false"/>
+          <w:bCs w:val="false"/>
+          <w:sz w:val="28"/>
+          <w:szCs w:val="28"/>
+        </w:rPr>
+      </w:pPr>
+      <w:r>
+        <w:rPr>
+          <w:b w:val="false"/>
+          <w:bCs w:val="false"/>
+          <w:sz w:val="24"/>
+          <w:szCs w:val="24"/>
+        </w:rPr>
+      </w:r>
+    </w:p>
+    <w:p>
+      <w:pPr>
+        <w:pStyle w:val="BodyText"/>
+        <w:rPr>
+          <w:b w:val="false"/>
+          <w:bCs w:val="false"/>
+          <w:sz w:val="28"/>
+          <w:szCs w:val="28"/>
+        </w:rPr>
+      </w:pPr>
+      <w:r>
+        <w:rPr>
+          <w:b w:val="false"/>
+          <w:bCs w:val="false"/>
+          <w:sz w:val="24"/>
+          <w:szCs w:val="24"/>
+        </w:rPr>
+        <w:t>TS2-0003:</w:t>
+      </w:r>
+    </w:p>
+    <w:p>
+      <w:pPr>
+        <w:pStyle w:val="BodyText"/>
+        <w:rPr>
+          <w:b w:val="false"/>
+          <w:bCs w:val="false"/>
+          <w:sz w:val="28"/>
+          <w:szCs w:val="28"/>
+        </w:rPr>
+      </w:pPr>
+      <w:r>
+        <w:rPr>
+          <w:b w:val="false"/>
+          <w:bCs w:val="false"/>
+          <w:sz w:val="24"/>
+          <w:szCs w:val="24"/>
+        </w:rPr>
+        <w:tab/>
+        <w:t>Using the multi-meter in resistance mode, check between TP4 (RS485 RX) and TP7 (GND) and verify that the resistance is greater than 1KΩ.</w:t>
+      </w:r>
+    </w:p>
+    <w:p>
+      <w:pPr>
+        <w:pStyle w:val="BodyText"/>
+        <w:rPr>
+          <w:b w:val="false"/>
+          <w:bCs w:val="false"/>
+          <w:sz w:val="28"/>
+          <w:szCs w:val="28"/>
+        </w:rPr>
+      </w:pPr>
+      <w:r>
+        <w:rPr>
+          <w:b w:val="false"/>
+          <w:bCs w:val="false"/>
+          <w:sz w:val="24"/>
+          <w:szCs w:val="24"/>
+        </w:rPr>
+        <w:t>TS2-0004:</w:t>
+      </w:r>
+    </w:p>
+    <w:p>
+      <w:pPr>
+        <w:pStyle w:val="BodyText"/>
+        <w:rPr>
+          <w:b w:val="false"/>
+          <w:bCs w:val="false"/>
+          <w:sz w:val="28"/>
+          <w:szCs w:val="28"/>
+        </w:rPr>
+      </w:pPr>
+      <w:r>
+        <w:rPr>
+          <w:b w:val="false"/>
+          <w:bCs w:val="false"/>
+          <w:sz w:val="24"/>
+          <w:szCs w:val="24"/>
+        </w:rPr>
+        <w:tab/>
+        <w:t>Using the multi-meter in resistance mode, check between TP5 (RS485 DIR) and TP7 (GND) and verify that the resistance is greater than 1KΩ.</w:t>
+      </w:r>
+    </w:p>
+    <w:p>
+      <w:pPr>
+        <w:pStyle w:val="BodyText"/>
+        <w:rPr>
+          <w:b w:val="false"/>
+          <w:bCs w:val="false"/>
+          <w:sz w:val="28"/>
+          <w:szCs w:val="28"/>
+        </w:rPr>
+      </w:pPr>
+      <w:r>
+        <w:rPr>
+          <w:b w:val="false"/>
+          <w:bCs w:val="false"/>
+          <w:sz w:val="24"/>
+          <w:szCs w:val="24"/>
+        </w:rPr>
+        <w:t>TS2-0005:</w:t>
+      </w:r>
+    </w:p>
+    <w:p>
+      <w:pPr>
+        <w:pStyle w:val="BodyText"/>
+        <w:rPr>
+          <w:b w:val="false"/>
+          <w:bCs w:val="false"/>
+          <w:sz w:val="28"/>
+          <w:szCs w:val="28"/>
+        </w:rPr>
+      </w:pPr>
+      <w:r>
+        <w:rPr>
+          <w:b w:val="false"/>
+          <w:bCs w:val="false"/>
+          <w:sz w:val="24"/>
+          <w:szCs w:val="24"/>
+        </w:rPr>
+        <w:tab/>
+        <w:tab/>
       </w:r>
     </w:p>
     <w:p>
@@ -1604,7 +1911,7 @@
     <w:pPr>
       <w:pStyle w:val="Footer"/>
       <w:bidi w:val="0"/>
-      <w:jc w:val="end"/>
+      <w:jc w:val="right"/>
       <w:rPr/>
     </w:pPr>
     <w:r>
@@ -1638,7 +1945,7 @@
     <w:pPr>
       <w:pStyle w:val="Footer"/>
       <w:bidi w:val="0"/>
-      <w:jc w:val="start"/>
+      <w:jc w:val="left"/>
       <w:rPr/>
     </w:pPr>
     <w:r>
@@ -1653,7 +1960,7 @@
     <w:pPr>
       <w:pStyle w:val="Footer"/>
       <w:bidi w:val="0"/>
-      <w:jc w:val="start"/>
+      <w:jc w:val="left"/>
       <w:rPr/>
     </w:pPr>
     <w:r>
@@ -1678,7 +1985,7 @@
     <w:pPr>
       <w:pStyle w:val="Footer"/>
       <w:bidi w:val="0"/>
-      <w:jc w:val="end"/>
+      <w:jc w:val="right"/>
       <w:rPr/>
     </w:pPr>
     <w:r>
@@ -1712,7 +2019,7 @@
     <w:pPr>
       <w:pStyle w:val="Footer"/>
       <w:bidi w:val="0"/>
-      <w:jc w:val="start"/>
+      <w:jc w:val="left"/>
       <w:rPr/>
     </w:pPr>
     <w:r>
@@ -1727,7 +2034,7 @@
     <w:pPr>
       <w:pStyle w:val="Footer"/>
       <w:bidi w:val="0"/>
-      <w:jc w:val="start"/>
+      <w:jc w:val="left"/>
       <w:rPr/>
     </w:pPr>
     <w:r>
@@ -1766,60 +2073,31 @@
     <w:pPr>
       <w:pStyle w:val="Header"/>
       <w:bidi w:val="0"/>
-      <w:jc w:val="start"/>
+      <w:jc w:val="left"/>
       <w:rPr/>
     </w:pPr>
     <w:r>
       <w:rPr/>
-      <w:t xml:space="preserve">TITLE: </w:t>
-    </w:r>
-    <w:r>
-      <w:rPr/>
-      <w:t>Revision 2 Test Plan</w:t>
-    </w:r>
-    <w:r>
-      <w:rPr/>
+      <w:t>TITLE: Revision 2 Test Plan</w:t>
       <w:tab/>
       <w:tab/>
-      <w:t xml:space="preserve">PROJECT#: </w:t>
-    </w:r>
-    <w:r>
-      <w:rPr/>
-      <w:t>P1012202501</w:t>
+      <w:t>PROJECT#: P1012202501</w:t>
     </w:r>
   </w:p>
   <w:p>
     <w:pPr>
       <w:pStyle w:val="Header"/>
       <w:bidi w:val="0"/>
-      <w:jc w:val="start"/>
+      <w:jc w:val="left"/>
       <w:rPr/>
     </w:pPr>
     <w:r>
       <w:rPr/>
-      <w:t xml:space="preserve">DOC ID#: </w:t>
-    </w:r>
-    <w:r>
-      <w:rPr/>
-      <w:t>P1012202501-1</w:t>
-    </w:r>
-    <w:r>
-      <w:rPr/>
+      <w:t>DOC ID#: P1012202501-1</w:t>
       <w:tab/>
-      <w:t xml:space="preserve">REV: </w:t>
-    </w:r>
-    <w:r>
-      <w:rPr/>
-      <w:t>2</w:t>
-    </w:r>
-    <w:r>
-      <w:rPr/>
+      <w:t>REV: 2</w:t>
       <w:tab/>
-      <w:t xml:space="preserve">DATE: </w:t>
-    </w:r>
-    <w:r>
-      <w:rPr/>
-      <w:t>2/28/2026</w:t>
+      <w:t>DATE: 2/28/2026</w:t>
     </w:r>
   </w:p>
 </w:hdr>
@@ -1831,60 +2109,31 @@
     <w:pPr>
       <w:pStyle w:val="Header"/>
       <w:bidi w:val="0"/>
-      <w:jc w:val="start"/>
+      <w:jc w:val="left"/>
       <w:rPr/>
     </w:pPr>
     <w:r>
       <w:rPr/>
-      <w:t xml:space="preserve">TITLE: </w:t>
-    </w:r>
-    <w:r>
-      <w:rPr/>
-      <w:t>Revision 2 Test Plan</w:t>
-    </w:r>
-    <w:r>
-      <w:rPr/>
+      <w:t>TITLE: Revision 2 Test Plan</w:t>
       <w:tab/>
       <w:tab/>
-      <w:t xml:space="preserve">PROJECT#: </w:t>
-    </w:r>
-    <w:r>
-      <w:rPr/>
-      <w:t>P1012202501</w:t>
+      <w:t>PROJECT#: P1012202501</w:t>
     </w:r>
   </w:p>
   <w:p>
     <w:pPr>
       <w:pStyle w:val="Header"/>
       <w:bidi w:val="0"/>
-      <w:jc w:val="start"/>
+      <w:jc w:val="left"/>
       <w:rPr/>
     </w:pPr>
     <w:r>
       <w:rPr/>
-      <w:t xml:space="preserve">DOC ID#: </w:t>
-    </w:r>
-    <w:r>
-      <w:rPr/>
-      <w:t>P1012202501-1</w:t>
-    </w:r>
-    <w:r>
-      <w:rPr/>
+      <w:t>DOC ID#: P1012202501-1</w:t>
       <w:tab/>
-      <w:t xml:space="preserve">REV: </w:t>
-    </w:r>
-    <w:r>
-      <w:rPr/>
-      <w:t>2</w:t>
-    </w:r>
-    <w:r>
-      <w:rPr/>
+      <w:t>REV: 2</w:t>
       <w:tab/>
-      <w:t xml:space="preserve">DATE: </w:t>
-    </w:r>
-    <w:r>
-      <w:rPr/>
-      <w:t>2/28/2026</w:t>
+      <w:t>DATE: 2/28/2026</w:t>
     </w:r>
   </w:p>
 </w:hdr>
@@ -1898,12 +2147,12 @@
       <w:numFmt w:val="none"/>
       <w:suff w:val="nothing"/>
       <w:lvlText w:val=""/>
-      <w:lvlJc w:val="start"/>
+      <w:lvlJc w:val="left"/>
       <w:pPr>
         <w:tabs>
           <w:tab w:val="num" w:pos="0"/>
         </w:tabs>
-        <w:ind w:start="0" w:hanging="0"/>
+        <w:ind w:left="0" w:hanging="0"/>
       </w:pPr>
       <w:rPr/>
     </w:lvl>
@@ -1912,12 +2161,12 @@
       <w:numFmt w:val="none"/>
       <w:suff w:val="nothing"/>
       <w:lvlText w:val=""/>
-      <w:lvlJc w:val="start"/>
+      <w:lvlJc w:val="left"/>
       <w:pPr>
         <w:tabs>
           <w:tab w:val="num" w:pos="0"/>
         </w:tabs>
-        <w:ind w:start="0" w:hanging="0"/>
+        <w:ind w:left="0" w:hanging="0"/>
       </w:pPr>
       <w:rPr/>
     </w:lvl>
@@ -1926,12 +2175,12 @@
       <w:numFmt w:val="none"/>
       <w:suff w:val="nothing"/>
       <w:lvlText w:val=""/>
-      <w:lvlJc w:val="start"/>
+      <w:lvlJc w:val="left"/>
       <w:pPr>
         <w:tabs>
           <w:tab w:val="num" w:pos="0"/>
         </w:tabs>
-        <w:ind w:start="0" w:hanging="0"/>
+        <w:ind w:left="0" w:hanging="0"/>
       </w:pPr>
       <w:rPr/>
     </w:lvl>
@@ -1940,12 +2189,12 @@
       <w:numFmt w:val="none"/>
       <w:suff w:val="nothing"/>
       <w:lvlText w:val=""/>
-      <w:lvlJc w:val="start"/>
+      <w:lvlJc w:val="left"/>
       <w:pPr>
         <w:tabs>
           <w:tab w:val="num" w:pos="0"/>
         </w:tabs>
-        <w:ind w:start="0" w:hanging="0"/>
+        <w:ind w:left="0" w:hanging="0"/>
       </w:pPr>
       <w:rPr/>
     </w:lvl>
@@ -1954,12 +2203,12 @@
       <w:numFmt w:val="none"/>
       <w:suff w:val="nothing"/>
       <w:lvlText w:val=""/>
-      <w:lvlJc w:val="start"/>
+      <w:lvlJc w:val="left"/>
       <w:pPr>
         <w:tabs>
           <w:tab w:val="num" w:pos="0"/>
         </w:tabs>
-        <w:ind w:start="0" w:hanging="0"/>
+        <w:ind w:left="0" w:hanging="0"/>
       </w:pPr>
       <w:rPr/>
     </w:lvl>
@@ -1968,12 +2217,12 @@
       <w:numFmt w:val="none"/>
       <w:suff w:val="nothing"/>
       <w:lvlText w:val=""/>
-      <w:lvlJc w:val="start"/>
+      <w:lvlJc w:val="left"/>
       <w:pPr>
         <w:tabs>
           <w:tab w:val="num" w:pos="0"/>
         </w:tabs>
-        <w:ind w:start="0" w:hanging="0"/>
+        <w:ind w:left="0" w:hanging="0"/>
       </w:pPr>
       <w:rPr/>
     </w:lvl>
@@ -1982,12 +2231,12 @@
       <w:numFmt w:val="none"/>
       <w:suff w:val="nothing"/>
       <w:lvlText w:val=""/>
-      <w:lvlJc w:val="start"/>
+      <w:lvlJc w:val="left"/>
       <w:pPr>
         <w:tabs>
           <w:tab w:val="num" w:pos="0"/>
         </w:tabs>
-        <w:ind w:start="0" w:hanging="0"/>
+        <w:ind w:left="0" w:hanging="0"/>
       </w:pPr>
       <w:rPr/>
     </w:lvl>
@@ -1996,12 +2245,12 @@
       <w:numFmt w:val="none"/>
       <w:suff w:val="nothing"/>
       <w:lvlText w:val=""/>
-      <w:lvlJc w:val="start"/>
+      <w:lvlJc w:val="left"/>
       <w:pPr>
         <w:tabs>
           <w:tab w:val="num" w:pos="0"/>
         </w:tabs>
-        <w:ind w:start="0" w:hanging="0"/>
+        <w:ind w:left="0" w:hanging="0"/>
       </w:pPr>
       <w:rPr/>
     </w:lvl>
@@ -2010,12 +2259,12 @@
       <w:numFmt w:val="none"/>
       <w:suff w:val="nothing"/>
       <w:lvlText w:val=""/>
-      <w:lvlJc w:val="start"/>
+      <w:lvlJc w:val="left"/>
       <w:pPr>
         <w:tabs>
           <w:tab w:val="num" w:pos="0"/>
         </w:tabs>
-        <w:ind w:start="0" w:hanging="0"/>
+        <w:ind w:left="0" w:hanging="0"/>
       </w:pPr>
       <w:rPr/>
     </w:lvl>
@@ -2025,12 +2274,12 @@
       <w:start w:val="1"/>
       <w:numFmt w:val="bullet"/>
       <w:lvlText w:val=""/>
-      <w:lvlJc w:val="start"/>
+      <w:lvlJc w:val="left"/>
       <w:pPr>
         <w:tabs>
           <w:tab w:val="num" w:pos="1429"/>
         </w:tabs>
-        <w:ind w:start="1429" w:hanging="360"/>
+        <w:ind w:left="1429" w:hanging="360"/>
       </w:pPr>
       <w:rPr>
         <w:rFonts w:ascii="Symbol" w:hAnsi="Symbol" w:cs="Symbol" w:hint="default"/>
@@ -2040,12 +2289,12 @@
       <w:start w:val="1"/>
       <w:numFmt w:val="bullet"/>
       <w:lvlText w:val="◦"/>
-      <w:lvlJc w:val="start"/>
+      <w:lvlJc w:val="left"/>
       <w:pPr>
         <w:tabs>
           <w:tab w:val="num" w:pos="1789"/>
         </w:tabs>
-        <w:ind w:start="1789" w:hanging="360"/>
+        <w:ind w:left="1789" w:hanging="360"/>
       </w:pPr>
       <w:rPr>
         <w:rFonts w:ascii="OpenSymbol" w:hAnsi="OpenSymbol" w:cs="OpenSymbol" w:hint="default"/>
@@ -2055,12 +2304,12 @@
       <w:start w:val="1"/>
       <w:numFmt w:val="bullet"/>
       <w:lvlText w:val="▪"/>
-      <w:lvlJc w:val="start"/>
+      <w:lvlJc w:val="left"/>
       <w:pPr>
         <w:tabs>
           <w:tab w:val="num" w:pos="2149"/>
         </w:tabs>
-        <w:ind w:start="2149" w:hanging="360"/>
+        <w:ind w:left="2149" w:hanging="360"/>
       </w:pPr>
       <w:rPr>
         <w:rFonts w:ascii="OpenSymbol" w:hAnsi="OpenSymbol" w:cs="OpenSymbol" w:hint="default"/>
@@ -2070,12 +2319,12 @@
       <w:start w:val="1"/>
       <w:numFmt w:val="bullet"/>
       <w:lvlText w:val=""/>
-      <w:lvlJc w:val="start"/>
+      <w:lvlJc w:val="left"/>
       <w:pPr>
         <w:tabs>
           <w:tab w:val="num" w:pos="2509"/>
         </w:tabs>
-        <w:ind w:start="2509" w:hanging="360"/>
+        <w:ind w:left="2509" w:hanging="360"/>
       </w:pPr>
       <w:rPr>
         <w:rFonts w:ascii="Symbol" w:hAnsi="Symbol" w:cs="Symbol" w:hint="default"/>
@@ -2085,12 +2334,12 @@
       <w:start w:val="1"/>
       <w:numFmt w:val="bullet"/>
       <w:lvlText w:val="◦"/>
-      <w:lvlJc w:val="start"/>
+      <w:lvlJc w:val="left"/>
       <w:pPr>
         <w:tabs>
           <w:tab w:val="num" w:pos="2869"/>
         </w:tabs>
-        <w:ind w:start="2869" w:hanging="360"/>
+        <w:ind w:left="2869" w:hanging="360"/>
       </w:pPr>
       <w:rPr>
         <w:rFonts w:ascii="OpenSymbol" w:hAnsi="OpenSymbol" w:cs="OpenSymbol" w:hint="default"/>
@@ -2100,12 +2349,12 @@
       <w:start w:val="1"/>
       <w:numFmt w:val="bullet"/>
       <w:lvlText w:val="▪"/>
-      <w:lvlJc w:val="start"/>
+      <w:lvlJc w:val="left"/>
       <w:pPr>
         <w:tabs>
           <w:tab w:val="num" w:pos="3229"/>
         </w:tabs>
-        <w:ind w:start="3229" w:hanging="360"/>
+        <w:ind w:left="3229" w:hanging="360"/>
       </w:pPr>
       <w:rPr>
         <w:rFonts w:ascii="OpenSymbol" w:hAnsi="OpenSymbol" w:cs="OpenSymbol" w:hint="default"/>
@@ -2115,12 +2364,12 @@
       <w:start w:val="1"/>
       <w:numFmt w:val="bullet"/>
       <w:lvlText w:val=""/>
-      <w:lvlJc w:val="start"/>
+      <w:lvlJc w:val="left"/>
       <w:pPr>
         <w:tabs>
           <w:tab w:val="num" w:pos="3589"/>
         </w:tabs>
-        <w:ind w:start="3589" w:hanging="360"/>
+        <w:ind w:left="3589" w:hanging="360"/>
       </w:pPr>
       <w:rPr>
         <w:rFonts w:ascii="Symbol" w:hAnsi="Symbol" w:cs="Symbol" w:hint="default"/>
@@ -2130,12 +2379,12 @@
       <w:start w:val="1"/>
       <w:numFmt w:val="bullet"/>
       <w:lvlText w:val="◦"/>
-      <w:lvlJc w:val="start"/>
+      <w:lvlJc w:val="left"/>
       <w:pPr>
         <w:tabs>
           <w:tab w:val="num" w:pos="3949"/>
         </w:tabs>
-        <w:ind w:start="3949" w:hanging="360"/>
+        <w:ind w:left="3949" w:hanging="360"/>
       </w:pPr>
       <w:rPr>
         <w:rFonts w:ascii="OpenSymbol" w:hAnsi="OpenSymbol" w:cs="OpenSymbol" w:hint="default"/>
@@ -2145,12 +2394,12 @@
       <w:start w:val="1"/>
       <w:numFmt w:val="bullet"/>
       <w:lvlText w:val="▪"/>
-      <w:lvlJc w:val="start"/>
+      <w:lvlJc w:val="left"/>
       <w:pPr>
         <w:tabs>
           <w:tab w:val="num" w:pos="4309"/>
         </w:tabs>
-        <w:ind w:start="4309" w:hanging="360"/>
+        <w:ind w:left="4309" w:hanging="360"/>
       </w:pPr>
       <w:rPr>
         <w:rFonts w:ascii="OpenSymbol" w:hAnsi="OpenSymbol" w:cs="OpenSymbol" w:hint="default"/>
@@ -2163,12 +2412,12 @@
       <w:numFmt w:val="none"/>
       <w:suff w:val="nothing"/>
       <w:lvlText w:val=""/>
-      <w:lvlJc w:val="start"/>
+      <w:lvlJc w:val="left"/>
       <w:pPr>
         <w:tabs>
           <w:tab w:val="num" w:pos="0"/>
         </w:tabs>
-        <w:ind w:start="0" w:hanging="0"/>
+        <w:ind w:left="0" w:hanging="0"/>
       </w:pPr>
     </w:lvl>
     <w:lvl w:ilvl="1">
@@ -2176,12 +2425,12 @@
       <w:numFmt w:val="none"/>
       <w:suff w:val="nothing"/>
       <w:lvlText w:val=""/>
-      <w:lvlJc w:val="start"/>
+      <w:lvlJc w:val="left"/>
       <w:pPr>
         <w:tabs>
           <w:tab w:val="num" w:pos="0"/>
         </w:tabs>
-        <w:ind w:start="0" w:hanging="0"/>
+        <w:ind w:left="0" w:hanging="0"/>
       </w:pPr>
     </w:lvl>
     <w:lvl w:ilvl="2">
@@ -2189,12 +2438,12 @@
       <w:numFmt w:val="none"/>
       <w:suff w:val="nothing"/>
       <w:lvlText w:val=""/>
-      <w:lvlJc w:val="start"/>
+      <w:lvlJc w:val="left"/>
       <w:pPr>
         <w:tabs>
           <w:tab w:val="num" w:pos="0"/>
         </w:tabs>
-        <w:ind w:start="0" w:hanging="0"/>
+        <w:ind w:left="0" w:hanging="0"/>
       </w:pPr>
     </w:lvl>
     <w:lvl w:ilvl="3">
@@ -2202,12 +2451,12 @@
       <w:numFmt w:val="none"/>
       <w:suff w:val="nothing"/>
       <w:lvlText w:val=""/>
-      <w:lvlJc w:val="start"/>
+      <w:lvlJc w:val="left"/>
       <w:pPr>
         <w:tabs>
           <w:tab w:val="num" w:pos="0"/>
         </w:tabs>
-        <w:ind w:start="0" w:hanging="0"/>
+        <w:ind w:left="0" w:hanging="0"/>
       </w:pPr>
     </w:lvl>
     <w:lvl w:ilvl="4">
@@ -2215,12 +2464,12 @@
       <w:numFmt w:val="none"/>
       <w:suff w:val="nothing"/>
       <w:lvlText w:val=""/>
-      <w:lvlJc w:val="start"/>
+      <w:lvlJc w:val="left"/>
       <w:pPr>
         <w:tabs>
           <w:tab w:val="num" w:pos="0"/>
         </w:tabs>
-        <w:ind w:start="0" w:hanging="0"/>
+        <w:ind w:left="0" w:hanging="0"/>
       </w:pPr>
     </w:lvl>
     <w:lvl w:ilvl="5">
@@ -2228,12 +2477,12 @@
       <w:numFmt w:val="none"/>
       <w:suff w:val="nothing"/>
       <w:lvlText w:val=""/>
-      <w:lvlJc w:val="start"/>
+      <w:lvlJc w:val="left"/>
       <w:pPr>
         <w:tabs>
           <w:tab w:val="num" w:pos="0"/>
         </w:tabs>
-        <w:ind w:start="0" w:hanging="0"/>
+        <w:ind w:left="0" w:hanging="0"/>
       </w:pPr>
     </w:lvl>
     <w:lvl w:ilvl="6">
@@ -2241,12 +2490,12 @@
       <w:numFmt w:val="none"/>
       <w:suff w:val="nothing"/>
       <w:lvlText w:val=""/>
-      <w:lvlJc w:val="start"/>
+      <w:lvlJc w:val="left"/>
       <w:pPr>
         <w:tabs>
           <w:tab w:val="num" w:pos="0"/>
         </w:tabs>
-        <w:ind w:start="0" w:hanging="0"/>
+        <w:ind w:left="0" w:hanging="0"/>
       </w:pPr>
     </w:lvl>
     <w:lvl w:ilvl="7">
@@ -2254,12 +2503,12 @@
       <w:numFmt w:val="none"/>
       <w:suff w:val="nothing"/>
       <w:lvlText w:val=""/>
-      <w:lvlJc w:val="start"/>
+      <w:lvlJc w:val="left"/>
       <w:pPr>
         <w:tabs>
           <w:tab w:val="num" w:pos="0"/>
         </w:tabs>
-        <w:ind w:start="0" w:hanging="0"/>
+        <w:ind w:left="0" w:hanging="0"/>
       </w:pPr>
     </w:lvl>
     <w:lvl w:ilvl="8">
@@ -2267,12 +2516,12 @@
       <w:numFmt w:val="none"/>
       <w:suff w:val="nothing"/>
       <w:lvlText w:val=""/>
-      <w:lvlJc w:val="start"/>
+      <w:lvlJc w:val="left"/>
       <w:pPr>
         <w:tabs>
           <w:tab w:val="num" w:pos="0"/>
         </w:tabs>
-        <w:ind w:start="0" w:hanging="0"/>
+        <w:ind w:left="0" w:hanging="0"/>
       </w:pPr>
     </w:lvl>
   </w:abstractNum>
@@ -2314,7 +2563,7 @@
       <w:suppressAutoHyphens w:val="true"/>
       <w:bidi w:val="0"/>
       <w:spacing w:before="0" w:after="0"/>
-      <w:jc w:val="start"/>
+      <w:jc w:val="left"/>
     </w:pPr>
     <w:rPr>
       <w:rFonts w:ascii="Liberation Serif" w:hAnsi="Liberation Serif" w:eastAsia="NSimSun" w:cs="Lucida Sans"/>
@@ -2365,8 +2614,8 @@
       <w:szCs w:val="32"/>
     </w:rPr>
   </w:style>
-  <w:style w:type="character" w:styleId="Bulletsuser">
-    <w:name w:val="Bullets (user)"/>
+  <w:style w:type="character" w:styleId="Bullets">
+    <w:name w:val="Bullets"/>
     <w:qFormat/>
     <w:rPr>
       <w:rFonts w:ascii="OpenSymbol" w:hAnsi="OpenSymbol" w:eastAsia="OpenSymbol" w:cs="OpenSymbol"/>

</xml_diff>

<commit_message>
Updated files from video stream.
</commit_message>
<xml_diff>
--- a/_Projects/P1012202501-ESP32_Stepper_Controller/ProjectDocuments/P1012202501-1 Revision 2 Test Plan.docx
+++ b/_Projects/P1012202501-ESP32_Stepper_Controller/ProjectDocuments/P1012202501-1 Revision 2 Test Plan.docx
@@ -310,6 +310,14 @@
     <w:tbl>
       <w:tblPr>
         <w:tblW w:w="9975" w:type="dxa"/>
+        <w:tblBorders>
+          <w:top w:val="single" w:sz="4" w:space="0" w:color="auto"/>
+          <w:left w:val="single" w:sz="4" w:space="0" w:color="auto"/>
+          <w:bottom w:val="single" w:sz="4" w:space="0" w:color="auto"/>
+          <w:right w:val="single" w:sz="4" w:space="0" w:color="auto"/>
+          <w:insideH w:val="single" w:sz="4" w:space="0" w:color="auto"/>
+          <w:insideV w:val="single" w:sz="4" w:space="0" w:color="auto"/>
+        </w:tblBorders>
         <w:tblLayout w:type="fixed"/>
         <w:tblCellMar>
           <w:left w:w="0" w:type="dxa"/>
@@ -671,16 +679,42 @@
       </w:pPr>
       <w:r>
         <w:tab/>
-        <w:t>Copy the “QA-0002-Test Plan Log Template.xlsx” to the `Project Directory/ProjectDocuments/test-logs` and rename it to “P1012202501-2 Revision 2 Test Log.xlsx”. Edit the “P1012202501-2 Revision 2 Test Log.xlsx” file and fill in the appropriate project related information in the top right section of the form and save the file. Duplicate the sheet and rename the new sheet to the serial number of the PCB being tested. Duplicate and rename the sheet for all PCB assemblies involved in the testing.</w:t>
-      </w:r>
-    </w:p>
-    <w:p>
-      <w:pPr>
-        <w:pStyle w:val="BodyText"/>
-      </w:pPr>
-      <w:r>
-        <w:tab/>
-        <w:t xml:space="preserve"> If at anytime testing has a failure condition, please stop the test and investigate/repair the issue. Continue the testing after any failure condition has been remedied and take notes on the issue and what was necessary to resolve it. If the issue cannot be resolved, stop the testing and elevate to direct supervisor for next steps.</w:t>
+        <w:t>Copy the “QA-0002-Test Plan Log Template.xlsx” to the `Project Directory/</w:t>
+      </w:r>
+      <w:proofErr w:type="spellStart"/>
+      <w:r>
+        <w:t>ProjectDocuments</w:t>
+      </w:r>
+      <w:proofErr w:type="spellEnd"/>
+      <w:r>
+        <w:t>/test-logs` and rename it to “P1012202501-2 Revision 2 Test Log.xlsx”. Edit the “P1012202501-2 Revision 2 Test Log.xlsx” file and fill in the appropriate project related information in the top right section of the form and save the file. Duplicate the sheet and rename the new sheet to the serial number of the PCB being tested. Duplicate and rename the sheet for all PCB assemblies involved in the testing.</w:t>
+      </w:r>
+    </w:p>
+    <w:p>
+      <w:pPr>
+        <w:pStyle w:val="BodyText"/>
+      </w:pPr>
+      <w:r>
+        <w:tab/>
+        <w:t xml:space="preserve"> If at </w:t>
+      </w:r>
+      <w:proofErr w:type="spellStart"/>
+      <w:proofErr w:type="gramStart"/>
+      <w:r>
+        <w:t>anytime</w:t>
+      </w:r>
+      <w:proofErr w:type="spellEnd"/>
+      <w:proofErr w:type="gramEnd"/>
+      <w:r>
+        <w:t xml:space="preserve"> testing has a failure condition, please stop the test and investigate/repair the issue. Continue the testing after any failure condition has been remedied and take notes on the issue and what was necessary to resolve it. If the issue cannot be resolved, stop the testing and </w:t>
+      </w:r>
+      <w:proofErr w:type="gramStart"/>
+      <w:r>
+        <w:t>elevate to</w:t>
+      </w:r>
+      <w:proofErr w:type="gramEnd"/>
+      <w:r>
+        <w:t xml:space="preserve"> direct supervisor for next steps.</w:t>
       </w:r>
     </w:p>
     <w:p>
@@ -762,8 +796,6 @@
       </w:pPr>
       <w:r>
         <w:tab/>
-      </w:r>
-      <w:r>
         <w:t>This section is to help visually identify assembly defects that could cause undesired operation.</w:t>
       </w:r>
     </w:p>
@@ -1094,8 +1126,6 @@
       <w:r>
         <w:lastRenderedPageBreak/>
         <w:tab/>
-      </w:r>
-      <w:r>
         <w:t>Using the multi-meter in resistance mode, ensure that J1 does not have a jumper installed then check between CN2 Terminal 1 and Terminal 2 and verify that the resistance is greater than 1KΩ.</w:t>
       </w:r>
     </w:p>
@@ -1447,8 +1477,6 @@
       </w:pPr>
       <w:r>
         <w:tab/>
-      </w:r>
-      <w:r>
         <w:t>Using the multi-meter in resistance mode, ensure that J2 does not have a jumper installed then check between CN3 Terminal 2 and Terminal 4 and verify that the resistance is greater than 1KΩ.</w:t>
       </w:r>
     </w:p>
@@ -2054,10 +2082,62 @@
         </w:rPr>
       </w:pPr>
       <w:r>
+        <w:t>TS2-0043:</w:t>
+      </w:r>
+    </w:p>
+    <w:p>
+      <w:pPr>
+        <w:pStyle w:val="BodyText"/>
+        <w:rPr>
+          <w:sz w:val="28"/>
+          <w:szCs w:val="28"/>
+        </w:rPr>
+      </w:pPr>
+      <w:r>
+        <w:tab/>
+        <w:t>Using the multi-meter in resistance mode, check between TP1</w:t>
+      </w:r>
+      <w:r>
+        <w:t xml:space="preserve">4 </w:t>
+      </w:r>
+      <w:r>
+        <w:t>(</w:t>
+      </w:r>
+      <w:r>
+        <w:t>Input</w:t>
+      </w:r>
+      <w:r>
+        <w:t xml:space="preserve"> 1) and TP1</w:t>
+      </w:r>
+      <w:r>
+        <w:t>7</w:t>
+      </w:r>
+      <w:r>
+        <w:t xml:space="preserve"> (GND) and verify that the resistance is greater than 1KΩ.</w:t>
+      </w:r>
+    </w:p>
+    <w:p>
+      <w:pPr>
+        <w:pStyle w:val="BodyText"/>
+        <w:rPr>
+          <w:sz w:val="28"/>
+          <w:szCs w:val="28"/>
+        </w:rPr>
+      </w:pPr>
+    </w:p>
+    <w:p>
+      <w:pPr>
+        <w:pStyle w:val="BodyText"/>
+        <w:rPr>
+          <w:sz w:val="28"/>
+          <w:szCs w:val="28"/>
+        </w:rPr>
+      </w:pPr>
+      <w:r>
         <w:t>TS2-00</w:t>
       </w:r>
       <w:r>
-        <w:t>43</w:t>
+        <w:t>44</w:t>
       </w:r>
       <w:r>
         <w:t>:</w:t>
@@ -2076,22 +2156,144 @@
         <w:t>Using the multi-meter in resistance mode, check between TP1</w:t>
       </w:r>
       <w:r>
-        <w:t xml:space="preserve">4 </w:t>
-      </w:r>
-      <w:r>
-        <w:t>(</w:t>
+        <w:t>5</w:t>
+      </w:r>
+      <w:r>
+        <w:t xml:space="preserve"> (</w:t>
       </w:r>
       <w:r>
         <w:t>Input</w:t>
       </w:r>
       <w:r>
+        <w:t xml:space="preserve"> 2) and TP1</w:t>
+      </w:r>
+      <w:r>
+        <w:t>7</w:t>
+      </w:r>
+      <w:r>
+        <w:t xml:space="preserve"> (GND) and verify that the resistance is greater than 1KΩ.</w:t>
+      </w:r>
+    </w:p>
+    <w:p>
+      <w:pPr>
+        <w:pStyle w:val="BodyText"/>
+        <w:rPr>
+          <w:sz w:val="28"/>
+          <w:szCs w:val="28"/>
+        </w:rPr>
+      </w:pPr>
+    </w:p>
+    <w:p>
+      <w:pPr>
+        <w:pStyle w:val="BodyText"/>
+        <w:rPr>
+          <w:sz w:val="28"/>
+          <w:szCs w:val="28"/>
+        </w:rPr>
+      </w:pPr>
+      <w:r>
+        <w:t>TS2-00</w:t>
+      </w:r>
+      <w:r>
+        <w:t>45</w:t>
+      </w:r>
+      <w:r>
+        <w:t>:</w:t>
+      </w:r>
+    </w:p>
+    <w:p>
+      <w:pPr>
+        <w:pStyle w:val="BodyText"/>
+        <w:rPr>
+          <w:sz w:val="28"/>
+          <w:szCs w:val="28"/>
+        </w:rPr>
+      </w:pPr>
+      <w:r>
+        <w:tab/>
+        <w:t>Using the multi-meter in resistance mode, check between TP1</w:t>
+      </w:r>
+      <w:r>
+        <w:t>6</w:t>
+      </w:r>
+      <w:r>
+        <w:t xml:space="preserve"> (</w:t>
+      </w:r>
+      <w:r>
+        <w:t>Input</w:t>
+      </w:r>
+      <w:r>
+        <w:t xml:space="preserve"> 3) and TP1</w:t>
+      </w:r>
+      <w:r>
+        <w:t>7</w:t>
+      </w:r>
+      <w:r>
+        <w:t xml:space="preserve"> (GND) and verify that the resistance is greater than 1KΩ.</w:t>
+      </w:r>
+    </w:p>
+    <w:p>
+      <w:pPr>
+        <w:pStyle w:val="BodyText"/>
+        <w:rPr>
+          <w:sz w:val="28"/>
+          <w:szCs w:val="28"/>
+        </w:rPr>
+      </w:pPr>
+    </w:p>
+    <w:p>
+      <w:pPr>
+        <w:pStyle w:val="BodyText"/>
+        <w:rPr>
+          <w:sz w:val="28"/>
+          <w:szCs w:val="28"/>
+        </w:rPr>
+      </w:pPr>
+      <w:r>
+        <w:t>TS2-00</w:t>
+      </w:r>
+      <w:r>
+        <w:t>46</w:t>
+      </w:r>
+      <w:r>
+        <w:t>:</w:t>
+      </w:r>
+    </w:p>
+    <w:p>
+      <w:pPr>
+        <w:pStyle w:val="BodyText"/>
+        <w:rPr>
+          <w:sz w:val="28"/>
+          <w:szCs w:val="28"/>
+        </w:rPr>
+      </w:pPr>
+      <w:r>
+        <w:tab/>
+        <w:t xml:space="preserve"> Using the multi-meter in resistance mode, check between TP1</w:t>
+      </w:r>
+      <w:r>
+        <w:t>4</w:t>
+      </w:r>
+      <w:r>
+        <w:t xml:space="preserve"> (</w:t>
+      </w:r>
+      <w:r>
+        <w:t>Input</w:t>
+      </w:r>
+      <w:r>
         <w:t xml:space="preserve"> 1) and TP1</w:t>
       </w:r>
       <w:r>
-        <w:t>7</w:t>
-      </w:r>
-      <w:r>
-        <w:t xml:space="preserve"> (GND) and verify that the resistance is greater than 1KΩ.</w:t>
+        <w:t>5</w:t>
+      </w:r>
+      <w:r>
+        <w:t xml:space="preserve"> (</w:t>
+      </w:r>
+      <w:r>
+        <w:t>Input</w:t>
+      </w:r>
+      <w:r>
+        <w:t xml:space="preserve"> 2) and verify that the resistance is greater than 1KΩ.</w:t>
       </w:r>
     </w:p>
     <w:p>
@@ -2115,7 +2317,7 @@
         <w:t>TS2-00</w:t>
       </w:r>
       <w:r>
-        <w:t>44</w:t>
+        <w:t>47</w:t>
       </w:r>
       <w:r>
         <w:t>:</w:t>
@@ -2134,6 +2336,71 @@
         <w:t>Using the multi-meter in resistance mode, check between TP1</w:t>
       </w:r>
       <w:r>
+        <w:t>4</w:t>
+      </w:r>
+      <w:r>
+        <w:t xml:space="preserve"> (</w:t>
+      </w:r>
+      <w:r>
+        <w:t>Input</w:t>
+      </w:r>
+      <w:r>
+        <w:t xml:space="preserve"> 1) and TP1</w:t>
+      </w:r>
+      <w:r>
+        <w:t>6</w:t>
+      </w:r>
+      <w:r>
+        <w:t xml:space="preserve"> (</w:t>
+      </w:r>
+      <w:r>
+        <w:t>Input</w:t>
+      </w:r>
+      <w:r>
+        <w:t xml:space="preserve"> 3) and verify that the resistance is greater than 1KΩ.</w:t>
+      </w:r>
+    </w:p>
+    <w:p>
+      <w:pPr>
+        <w:pStyle w:val="BodyText"/>
+        <w:rPr>
+          <w:sz w:val="28"/>
+          <w:szCs w:val="28"/>
+        </w:rPr>
+      </w:pPr>
+    </w:p>
+    <w:p>
+      <w:pPr>
+        <w:pStyle w:val="BodyText"/>
+      </w:pPr>
+    </w:p>
+    <w:p>
+      <w:pPr>
+        <w:pStyle w:val="BodyText"/>
+        <w:rPr>
+          <w:sz w:val="28"/>
+          <w:szCs w:val="28"/>
+        </w:rPr>
+      </w:pPr>
+      <w:r>
+        <w:t>TS2-00</w:t>
+      </w:r>
+      <w:r>
+        <w:t>48</w:t>
+      </w:r>
+      <w:r>
+        <w:t>:</w:t>
+      </w:r>
+    </w:p>
+    <w:p>
+      <w:pPr>
+        <w:pStyle w:val="BodyText"/>
+      </w:pPr>
+      <w:r>
+        <w:tab/>
+        <w:t>Using the multi-meter in resistance mode, check between TP1</w:t>
+      </w:r>
+      <w:r>
         <w:t>5</w:t>
       </w:r>
       <w:r>
@@ -2146,52 +2413,6 @@
         <w:t xml:space="preserve"> 2) and TP1</w:t>
       </w:r>
       <w:r>
-        <w:t>7</w:t>
-      </w:r>
-      <w:r>
-        <w:t xml:space="preserve"> (GND) and verify that the resistance is greater than 1KΩ.</w:t>
-      </w:r>
-    </w:p>
-    <w:p>
-      <w:pPr>
-        <w:pStyle w:val="BodyText"/>
-        <w:rPr>
-          <w:sz w:val="28"/>
-          <w:szCs w:val="28"/>
-        </w:rPr>
-      </w:pPr>
-    </w:p>
-    <w:p>
-      <w:pPr>
-        <w:pStyle w:val="BodyText"/>
-        <w:rPr>
-          <w:sz w:val="28"/>
-          <w:szCs w:val="28"/>
-        </w:rPr>
-      </w:pPr>
-      <w:r>
-        <w:t>TS2-00</w:t>
-      </w:r>
-      <w:r>
-        <w:t>45</w:t>
-      </w:r>
-      <w:r>
-        <w:t>:</w:t>
-      </w:r>
-    </w:p>
-    <w:p>
-      <w:pPr>
-        <w:pStyle w:val="BodyText"/>
-        <w:rPr>
-          <w:sz w:val="28"/>
-          <w:szCs w:val="28"/>
-        </w:rPr>
-      </w:pPr>
-      <w:r>
-        <w:tab/>
-        <w:t>Using the multi-meter in resistance mode, check between TP1</w:t>
-      </w:r>
-      <w:r>
         <w:t>6</w:t>
       </w:r>
       <w:r>
@@ -2201,432 +2422,273 @@
         <w:t>Input</w:t>
       </w:r>
       <w:r>
-        <w:t xml:space="preserve"> 3) and TP1</w:t>
-      </w:r>
-      <w:r>
-        <w:t>7</w:t>
-      </w:r>
-      <w:r>
-        <w:t xml:space="preserve"> (GND) and verify that the resistance is greater than 1KΩ.</w:t>
-      </w:r>
-    </w:p>
-    <w:p>
-      <w:pPr>
-        <w:pStyle w:val="BodyText"/>
-        <w:rPr>
-          <w:sz w:val="28"/>
-          <w:szCs w:val="28"/>
-        </w:rPr>
-      </w:pPr>
-    </w:p>
-    <w:p>
-      <w:pPr>
-        <w:pStyle w:val="BodyText"/>
-        <w:rPr>
-          <w:sz w:val="28"/>
-          <w:szCs w:val="28"/>
-        </w:rPr>
-      </w:pPr>
-      <w:r>
-        <w:t>TS2-00</w:t>
-      </w:r>
-      <w:r>
-        <w:t>46</w:t>
-      </w:r>
-      <w:r>
-        <w:t>:</w:t>
-      </w:r>
-    </w:p>
-    <w:p>
-      <w:pPr>
-        <w:pStyle w:val="BodyText"/>
-        <w:rPr>
-          <w:sz w:val="28"/>
-          <w:szCs w:val="28"/>
-        </w:rPr>
-      </w:pPr>
-      <w:r>
-        <w:tab/>
-        <w:t xml:space="preserve"> Using the multi-meter in resistance mode, check between TP1</w:t>
-      </w:r>
-      <w:r>
-        <w:t>4</w:t>
-      </w:r>
-      <w:r>
-        <w:t xml:space="preserve"> (</w:t>
-      </w:r>
-      <w:r>
-        <w:t>Input</w:t>
-      </w:r>
-      <w:r>
-        <w:t xml:space="preserve"> 1) and TP1</w:t>
+        <w:t xml:space="preserve"> 3) and verify that the resistance is greater than 1KΩ.</w:t>
+      </w:r>
+    </w:p>
+    <w:p>
+      <w:pPr>
+        <w:pStyle w:val="BodyText"/>
+      </w:pPr>
+    </w:p>
+    <w:p>
+      <w:pPr>
+        <w:pStyle w:val="BodyText"/>
+        <w:rPr>
+          <w:sz w:val="28"/>
+          <w:szCs w:val="28"/>
+        </w:rPr>
+      </w:pPr>
+      <w:r>
+        <w:t>TS2-0049:</w:t>
+      </w:r>
+    </w:p>
+    <w:p>
+      <w:pPr>
+        <w:pStyle w:val="BodyText"/>
+      </w:pPr>
+      <w:r>
+        <w:lastRenderedPageBreak/>
+        <w:tab/>
+        <w:t>Using the multi-meter in resistance mode, check between TP8 (ESP_RX) and TP9 (ESP_TX) and verify that the resistance is greater than 5KΩ.</w:t>
+      </w:r>
+    </w:p>
+    <w:p>
+      <w:pPr>
+        <w:pStyle w:val="BodyText"/>
+      </w:pPr>
+    </w:p>
+    <w:p>
+      <w:pPr>
+        <w:pStyle w:val="BodyText"/>
+      </w:pPr>
+    </w:p>
+    <w:p>
+      <w:pPr>
+        <w:pStyle w:val="BodyText"/>
+      </w:pPr>
+    </w:p>
+    <w:p>
+      <w:pPr>
+        <w:pStyle w:val="BodyText"/>
+        <w:rPr>
+          <w:sz w:val="28"/>
+          <w:szCs w:val="28"/>
+        </w:rPr>
+      </w:pPr>
+      <w:r>
+        <w:t>TS2-0050:</w:t>
+      </w:r>
+    </w:p>
+    <w:p>
+      <w:pPr>
+        <w:pStyle w:val="BodyText"/>
+      </w:pPr>
+      <w:r>
+        <w:tab/>
+        <w:t xml:space="preserve">Using the multi-meter in resistance mode, check between TP26 (TEMP_SENSE) and TP7 (GND) and verify that the resistance is greater than </w:t>
       </w:r>
       <w:r>
         <w:t>5</w:t>
       </w:r>
       <w:r>
-        <w:t xml:space="preserve"> (</w:t>
-      </w:r>
-      <w:r>
-        <w:t>Input</w:t>
-      </w:r>
-      <w:r>
-        <w:t xml:space="preserve"> 2) and verify that the resistance is greater than 1KΩ.</w:t>
-      </w:r>
-    </w:p>
-    <w:p>
-      <w:pPr>
-        <w:pStyle w:val="BodyText"/>
-        <w:rPr>
-          <w:sz w:val="28"/>
-          <w:szCs w:val="28"/>
-        </w:rPr>
-      </w:pPr>
-    </w:p>
-    <w:p>
-      <w:pPr>
-        <w:pStyle w:val="BodyText"/>
-        <w:rPr>
-          <w:sz w:val="28"/>
-          <w:szCs w:val="28"/>
-        </w:rPr>
-      </w:pPr>
-      <w:r>
-        <w:t>TS2-00</w:t>
-      </w:r>
-      <w:r>
-        <w:t>47</w:t>
-      </w:r>
-      <w:r>
-        <w:t>:</w:t>
-      </w:r>
-    </w:p>
-    <w:p>
-      <w:pPr>
-        <w:pStyle w:val="BodyText"/>
-        <w:rPr>
-          <w:sz w:val="28"/>
-          <w:szCs w:val="28"/>
-        </w:rPr>
-      </w:pPr>
-      <w:r>
-        <w:tab/>
-        <w:t>Using the multi-meter in resistance mode, check between TP1</w:t>
-      </w:r>
-      <w:r>
-        <w:t>4</w:t>
-      </w:r>
-      <w:r>
-        <w:t xml:space="preserve"> (</w:t>
-      </w:r>
-      <w:r>
-        <w:t>Input</w:t>
-      </w:r>
-      <w:r>
-        <w:t xml:space="preserve"> 1) and TP1</w:t>
-      </w:r>
-      <w:r>
-        <w:t>6</w:t>
-      </w:r>
-      <w:r>
-        <w:t xml:space="preserve"> (</w:t>
-      </w:r>
-      <w:r>
-        <w:t>Input</w:t>
-      </w:r>
-      <w:r>
-        <w:t xml:space="preserve"> 3) and verify that the resistance is greater than 1KΩ.</w:t>
-      </w:r>
-    </w:p>
-    <w:p>
-      <w:pPr>
-        <w:pStyle w:val="BodyText"/>
-        <w:rPr>
-          <w:sz w:val="28"/>
-          <w:szCs w:val="28"/>
-        </w:rPr>
-      </w:pPr>
-    </w:p>
-    <w:p>
-      <w:pPr>
-        <w:pStyle w:val="BodyText"/>
-      </w:pPr>
-    </w:p>
-    <w:p>
-      <w:pPr>
-        <w:pStyle w:val="BodyText"/>
-        <w:rPr>
-          <w:sz w:val="28"/>
-          <w:szCs w:val="28"/>
-        </w:rPr>
-      </w:pPr>
-      <w:r>
-        <w:t>TS2-00</w:t>
-      </w:r>
-      <w:r>
-        <w:t>48</w:t>
-      </w:r>
-      <w:r>
-        <w:t>:</w:t>
-      </w:r>
-    </w:p>
-    <w:p>
-      <w:pPr>
-        <w:pStyle w:val="BodyText"/>
-      </w:pPr>
-      <w:r>
-        <w:tab/>
-        <w:t>Using the multi-meter in resistance mode, check between TP1</w:t>
-      </w:r>
-      <w:r>
-        <w:t>5</w:t>
-      </w:r>
-      <w:r>
-        <w:t xml:space="preserve"> (</w:t>
-      </w:r>
-      <w:r>
-        <w:t>Input</w:t>
-      </w:r>
-      <w:r>
-        <w:t xml:space="preserve"> 2) and TP1</w:t>
-      </w:r>
-      <w:r>
-        <w:t>6</w:t>
-      </w:r>
-      <w:r>
-        <w:t xml:space="preserve"> (</w:t>
-      </w:r>
-      <w:r>
-        <w:t>Input</w:t>
-      </w:r>
-      <w:r>
-        <w:t xml:space="preserve"> 3) and verify that the resistance is greater than 1KΩ.</w:t>
-      </w:r>
-    </w:p>
-    <w:p>
-      <w:pPr>
-        <w:pStyle w:val="BodyText"/>
-      </w:pPr>
-    </w:p>
-    <w:p>
-      <w:pPr>
-        <w:pStyle w:val="BodyText"/>
-        <w:rPr>
-          <w:sz w:val="28"/>
-          <w:szCs w:val="28"/>
-        </w:rPr>
-      </w:pPr>
-      <w:r>
-        <w:t>TS2-004</w:t>
+        <w:t>KΩ.</w:t>
+      </w:r>
+    </w:p>
+    <w:p>
+      <w:pPr>
+        <w:pStyle w:val="BodyText"/>
+      </w:pPr>
+    </w:p>
+    <w:p>
+      <w:pPr>
+        <w:pStyle w:val="BodyText"/>
+        <w:rPr>
+          <w:sz w:val="28"/>
+          <w:szCs w:val="28"/>
+        </w:rPr>
+      </w:pPr>
+      <w:r>
+        <w:t>TS2-0051:</w:t>
+      </w:r>
+    </w:p>
+    <w:p>
+      <w:pPr>
+        <w:pStyle w:val="BodyText"/>
+      </w:pPr>
+      <w:r>
+        <w:tab/>
+        <w:t>Using the multi-meter in resistance mode, check between TP27 (STP_ENABLE) and TP7 (GND) and verify that the resistance is greater than 5KΩ.</w:t>
+      </w:r>
+    </w:p>
+    <w:p>
+      <w:pPr>
+        <w:pStyle w:val="BodyText"/>
+      </w:pPr>
+    </w:p>
+    <w:p>
+      <w:pPr>
+        <w:pStyle w:val="BodyText"/>
+        <w:rPr>
+          <w:sz w:val="28"/>
+          <w:szCs w:val="28"/>
+        </w:rPr>
+      </w:pPr>
+      <w:r>
+        <w:t>TS2-0052:</w:t>
+      </w:r>
+    </w:p>
+    <w:p>
+      <w:pPr>
+        <w:pStyle w:val="BodyText"/>
+      </w:pPr>
+      <w:r>
+        <w:tab/>
+        <w:t>Using the multi-meter in resistance mode, check between TP28 (STP_RESET) and TP7 (GND) and verify that the resistance is greater than 5KΩ.</w:t>
+      </w:r>
+    </w:p>
+    <w:p>
+      <w:pPr>
+        <w:pStyle w:val="BodyText"/>
+      </w:pPr>
+    </w:p>
+    <w:p>
+      <w:pPr>
+        <w:pStyle w:val="BodyText"/>
+        <w:rPr>
+          <w:sz w:val="28"/>
+          <w:szCs w:val="28"/>
+        </w:rPr>
+      </w:pPr>
+      <w:r>
+        <w:t>TS2-0053:</w:t>
+      </w:r>
+    </w:p>
+    <w:p>
+      <w:pPr>
+        <w:pStyle w:val="BodyText"/>
+      </w:pPr>
+      <w:r>
+        <w:tab/>
+        <w:t>Using the multi-meter in resistance mode, check between TP2</w:t>
       </w:r>
       <w:r>
         <w:t>9</w:t>
       </w:r>
       <w:r>
-        <w:t>:</w:t>
-      </w:r>
-    </w:p>
-    <w:p>
-      <w:pPr>
-        <w:pStyle w:val="BodyText"/>
-      </w:pPr>
-      <w:r>
-        <w:lastRenderedPageBreak/>
+        <w:t xml:space="preserve"> (STP_DIR) and TP7 (GND) and verify that the resistance is greater than 5KΩ.</w:t>
+      </w:r>
+    </w:p>
+    <w:p>
+      <w:pPr>
+        <w:pStyle w:val="BodyText"/>
+      </w:pPr>
+    </w:p>
+    <w:p>
+      <w:pPr>
+        <w:pStyle w:val="BodyText"/>
+        <w:rPr>
+          <w:sz w:val="28"/>
+          <w:szCs w:val="28"/>
+        </w:rPr>
+      </w:pPr>
+      <w:r>
+        <w:t>TS2-0054:</w:t>
+      </w:r>
+    </w:p>
+    <w:p>
+      <w:pPr>
+        <w:pStyle w:val="BodyText"/>
+      </w:pPr>
+      <w:r>
+        <w:tab/>
+        <w:t>Using the multi-meter in resistance mode, check between TP30 (STP_STEP) and TP7 (GND) and verify that the resistance is greater than 5KΩ.</w:t>
+      </w:r>
+    </w:p>
+    <w:p>
+      <w:pPr>
+        <w:pStyle w:val="BodyText"/>
+      </w:pPr>
+    </w:p>
+    <w:p>
+      <w:pPr>
+        <w:pStyle w:val="BodyText"/>
+        <w:rPr>
+          <w:sz w:val="28"/>
+          <w:szCs w:val="28"/>
+        </w:rPr>
+      </w:pPr>
+      <w:r>
+        <w:t>TS2-0055:</w:t>
+      </w:r>
+    </w:p>
+    <w:p>
+      <w:pPr>
+        <w:pStyle w:val="BodyText"/>
+      </w:pPr>
+      <w:r>
+        <w:tab/>
+        <w:t>Using the multi-meter in resistance mode, check between TP31 (STP_MS0) and TP7 (GND) and verify that the resistance is greater than 5KΩ.</w:t>
+      </w:r>
+    </w:p>
+    <w:p>
+      <w:pPr>
+        <w:pStyle w:val="BodyText"/>
+      </w:pPr>
+    </w:p>
+    <w:p>
+      <w:pPr>
+        <w:pStyle w:val="BodyText"/>
+        <w:rPr>
+          <w:sz w:val="28"/>
+          <w:szCs w:val="28"/>
+        </w:rPr>
+      </w:pPr>
+      <w:r>
+        <w:t>TS2-0056:</w:t>
+      </w:r>
+    </w:p>
+    <w:p>
+      <w:pPr>
+        <w:pStyle w:val="BodyText"/>
+      </w:pPr>
+      <w:r>
+        <w:tab/>
+        <w:t>Using the multi-meter in resistance mode, check between TP32 (STP_MS1) and TP7 (GND) and verify that the resistance is greater than 5KΩ.</w:t>
+      </w:r>
+    </w:p>
+    <w:p>
+      <w:pPr>
+        <w:pStyle w:val="BodyText"/>
+      </w:pPr>
+    </w:p>
+    <w:p>
+      <w:pPr>
+        <w:pStyle w:val="BodyText"/>
+        <w:rPr>
+          <w:sz w:val="28"/>
+          <w:szCs w:val="28"/>
+        </w:rPr>
+      </w:pPr>
+      <w:r>
+        <w:t>TS2-0057:</w:t>
+      </w:r>
+    </w:p>
+    <w:p>
+      <w:pPr>
+        <w:pStyle w:val="BodyText"/>
+      </w:pPr>
+      <w:r>
         <w:tab/>
         <w:t>Using the multi-meter in resistance mode, check between TP</w:t>
       </w:r>
       <w:r>
-        <w:t>8</w:t>
-      </w:r>
-      <w:r>
-        <w:t xml:space="preserve"> (</w:t>
-      </w:r>
-      <w:r>
-        <w:t>ESP_RX</w:t>
-      </w:r>
-      <w:r>
-        <w:t>) and TP</w:t>
-      </w:r>
-      <w:r>
-        <w:t>9</w:t>
-      </w:r>
-      <w:r>
-        <w:t xml:space="preserve"> (</w:t>
-      </w:r>
-      <w:r>
-        <w:t>ESP_TX</w:t>
-      </w:r>
-      <w:r>
-        <w:t xml:space="preserve">) and verify that the resistance is greater than </w:t>
-      </w:r>
-      <w:r>
-        <w:t>5</w:t>
-      </w:r>
-      <w:r>
-        <w:t>KΩ.</w:t>
-      </w:r>
-    </w:p>
-    <w:p>
-      <w:pPr>
-        <w:pStyle w:val="BodyText"/>
-      </w:pPr>
-    </w:p>
-    <w:p>
-      <w:pPr>
-        <w:pStyle w:val="BodyText"/>
-      </w:pPr>
-    </w:p>
-    <w:p>
-      <w:pPr>
-        <w:pStyle w:val="BodyText"/>
-      </w:pPr>
-    </w:p>
-    <w:p>
-      <w:pPr>
-        <w:pStyle w:val="BodyText"/>
-        <w:rPr>
-          <w:sz w:val="28"/>
-          <w:szCs w:val="28"/>
-        </w:rPr>
-      </w:pPr>
-      <w:r>
-        <w:t>TS2-00</w:t>
-      </w:r>
-      <w:r>
-        <w:t>50</w:t>
-      </w:r>
-      <w:r>
-        <w:t>:</w:t>
-      </w:r>
-    </w:p>
-    <w:p>
-      <w:pPr>
-        <w:pStyle w:val="BodyText"/>
-      </w:pPr>
-      <w:r>
-        <w:tab/>
-        <w:t>Using the multi-meter in resistance mode, check between TP</w:t>
-      </w:r>
-      <w:r>
-        <w:t>26</w:t>
-      </w:r>
-      <w:r>
-        <w:t xml:space="preserve"> (</w:t>
-      </w:r>
-      <w:r>
-        <w:t>TEMP_SENSE</w:t>
-      </w:r>
-      <w:r>
-        <w:t>) and TP</w:t>
-      </w:r>
-      <w:r>
-        <w:t>7</w:t>
-      </w:r>
-      <w:r>
-        <w:t xml:space="preserve"> (</w:t>
-      </w:r>
-      <w:r>
-        <w:t>GND</w:t>
-      </w:r>
-      <w:r>
-        <w:t xml:space="preserve">) and verify that the resistance is greater than </w:t>
-      </w:r>
-      <w:r>
-        <w:t>5</w:t>
-      </w:r>
-      <w:r>
-        <w:t>KΩ.</w:t>
-      </w:r>
-    </w:p>
-    <w:p>
-      <w:pPr>
-        <w:pStyle w:val="BodyText"/>
-      </w:pPr>
-    </w:p>
-    <w:p>
-      <w:pPr>
-        <w:pStyle w:val="BodyText"/>
-        <w:rPr>
-          <w:sz w:val="28"/>
-          <w:szCs w:val="28"/>
-        </w:rPr>
-      </w:pPr>
-      <w:r>
-        <w:t>TS2-005</w:t>
-      </w:r>
-      <w:r>
-        <w:t>1</w:t>
-      </w:r>
-      <w:r>
-        <w:t>:</w:t>
-      </w:r>
-    </w:p>
-    <w:p>
-      <w:pPr>
-        <w:pStyle w:val="BodyText"/>
-      </w:pPr>
-      <w:r>
-        <w:tab/>
-        <w:t>Using the multi-meter in resistance mode, check between TP2</w:t>
-      </w:r>
-      <w:r>
-        <w:t>7</w:t>
-      </w:r>
-      <w:r>
-        <w:t xml:space="preserve"> (</w:t>
-      </w:r>
-      <w:r>
-        <w:t>STP_ENABLE</w:t>
-      </w:r>
-      <w:r>
-        <w:t xml:space="preserve">) and TP7 (GND) and verify that the resistance is greater than </w:t>
-      </w:r>
-      <w:r>
-        <w:t>5</w:t>
-      </w:r>
-      <w:r>
-        <w:t>KΩ.</w:t>
-      </w:r>
-    </w:p>
-    <w:p>
-      <w:pPr>
-        <w:pStyle w:val="BodyText"/>
-      </w:pPr>
-    </w:p>
-    <w:p>
-      <w:pPr>
-        <w:pStyle w:val="BodyText"/>
-        <w:rPr>
-          <w:sz w:val="28"/>
-          <w:szCs w:val="28"/>
-        </w:rPr>
-      </w:pPr>
-      <w:r>
-        <w:t>TS2-005</w:t>
-      </w:r>
-      <w:r>
-        <w:t>2</w:t>
-      </w:r>
-      <w:r>
-        <w:t>:</w:t>
-      </w:r>
-    </w:p>
-    <w:p>
-      <w:pPr>
-        <w:pStyle w:val="BodyText"/>
-      </w:pPr>
-      <w:r>
-        <w:tab/>
-        <w:t>Using the multi-meter in resistance mode, check between TP2</w:t>
-      </w:r>
-      <w:r>
-        <w:t>8</w:t>
+        <w:t>33</w:t>
       </w:r>
       <w:r>
         <w:t xml:space="preserve"> (STP_</w:t>
       </w:r>
       <w:r>
-        <w:t>RESET</w:t>
+        <w:t>MS2</w:t>
       </w:r>
       <w:r>
         <w:t>) and TP7 (GND) and verify that the resistance is greater than 5KΩ.</w:t>
@@ -2646,346 +2708,72 @@
         </w:rPr>
       </w:pPr>
       <w:r>
-        <w:t>TS2-005</w:t>
-      </w:r>
-      <w:r>
-        <w:t>3</w:t>
-      </w:r>
-      <w:r>
-        <w:t>:</w:t>
-      </w:r>
-    </w:p>
-    <w:p>
-      <w:pPr>
-        <w:pStyle w:val="BodyText"/>
-      </w:pPr>
-      <w:r>
-        <w:tab/>
-        <w:t>Using the multi-meter in resistance mode, check between TP2</w:t>
-      </w:r>
-      <w:r>
-        <w:t>9</w:t>
-      </w:r>
-      <w:r>
-        <w:t xml:space="preserve"> (STP_</w:t>
-      </w:r>
-      <w:r>
-        <w:t>DIR</w:t>
-      </w:r>
-      <w:r>
-        <w:t>) and TP7 (GND) and verify that the resistance is greater than 5KΩ.</w:t>
-      </w:r>
-    </w:p>
-    <w:p>
-      <w:pPr>
-        <w:pStyle w:val="BodyText"/>
-      </w:pPr>
-    </w:p>
-    <w:p>
-      <w:pPr>
-        <w:pStyle w:val="BodyText"/>
-        <w:rPr>
-          <w:sz w:val="28"/>
-          <w:szCs w:val="28"/>
-        </w:rPr>
-      </w:pPr>
-      <w:r>
-        <w:t>TS2-005</w:t>
-      </w:r>
-      <w:r>
-        <w:t>4</w:t>
-      </w:r>
-      <w:r>
-        <w:t>:</w:t>
-      </w:r>
-    </w:p>
-    <w:p>
-      <w:pPr>
-        <w:pStyle w:val="BodyText"/>
-      </w:pPr>
-      <w:r>
-        <w:tab/>
-        <w:t>Using the multi-meter in resistance mode, check between TP</w:t>
-      </w:r>
-      <w:r>
-        <w:t>30</w:t>
-      </w:r>
-      <w:r>
-        <w:t xml:space="preserve"> (STP_</w:t>
-      </w:r>
-      <w:r>
-        <w:t>STEP</w:t>
-      </w:r>
-      <w:r>
-        <w:t>) and TP7 (GND) and verify that the resistance is greater than 5KΩ.</w:t>
-      </w:r>
-    </w:p>
-    <w:p>
-      <w:pPr>
-        <w:pStyle w:val="BodyText"/>
-      </w:pPr>
-    </w:p>
-    <w:p>
-      <w:pPr>
-        <w:pStyle w:val="BodyText"/>
-        <w:rPr>
-          <w:sz w:val="28"/>
-          <w:szCs w:val="28"/>
-        </w:rPr>
-      </w:pPr>
-      <w:r>
-        <w:t>TS2-005</w:t>
-      </w:r>
-      <w:r>
-        <w:t>5</w:t>
-      </w:r>
-      <w:r>
-        <w:t>:</w:t>
-      </w:r>
-    </w:p>
-    <w:p>
-      <w:pPr>
-        <w:pStyle w:val="BodyText"/>
-      </w:pPr>
-      <w:r>
-        <w:tab/>
-        <w:t>Using the multi-meter in resistance mode, check between TP</w:t>
-      </w:r>
-      <w:r>
-        <w:t>31</w:t>
-      </w:r>
-      <w:r>
-        <w:t xml:space="preserve"> (STP_</w:t>
-      </w:r>
-      <w:r>
-        <w:t>MS0</w:t>
-      </w:r>
-      <w:r>
-        <w:t>) and TP7 (GND) and verify that the resistance is greater than 5KΩ.</w:t>
-      </w:r>
-    </w:p>
-    <w:p>
-      <w:pPr>
-        <w:pStyle w:val="BodyText"/>
-      </w:pPr>
-    </w:p>
-    <w:p>
-      <w:pPr>
-        <w:pStyle w:val="BodyText"/>
-        <w:rPr>
-          <w:sz w:val="28"/>
-          <w:szCs w:val="28"/>
-        </w:rPr>
-      </w:pPr>
-      <w:r>
-        <w:t>TS2-005</w:t>
-      </w:r>
-      <w:r>
-        <w:t>6</w:t>
-      </w:r>
-      <w:r>
-        <w:t>:</w:t>
-      </w:r>
-    </w:p>
-    <w:p>
-      <w:pPr>
-        <w:pStyle w:val="BodyText"/>
-      </w:pPr>
-      <w:r>
-        <w:tab/>
-        <w:t>Using the multi-meter in resistance mode, check between TP</w:t>
-      </w:r>
-      <w:r>
-        <w:t>32</w:t>
-      </w:r>
-      <w:r>
-        <w:t xml:space="preserve"> (STP_</w:t>
-      </w:r>
-      <w:r>
-        <w:t>MS1</w:t>
-      </w:r>
-      <w:r>
-        <w:t>) and TP7 (GND) and verify that the resistance is greater than 5KΩ.</w:t>
-      </w:r>
-    </w:p>
-    <w:p>
-      <w:pPr>
-        <w:pStyle w:val="BodyText"/>
-      </w:pPr>
-    </w:p>
-    <w:p>
-      <w:pPr>
-        <w:pStyle w:val="BodyText"/>
-        <w:rPr>
-          <w:sz w:val="28"/>
-          <w:szCs w:val="28"/>
-        </w:rPr>
-      </w:pPr>
-      <w:r>
-        <w:t>TS2-005</w:t>
-      </w:r>
-      <w:r>
-        <w:t>7</w:t>
-      </w:r>
-      <w:r>
-        <w:t>:</w:t>
-      </w:r>
-    </w:p>
-    <w:p>
-      <w:pPr>
-        <w:pStyle w:val="BodyText"/>
-      </w:pPr>
-      <w:r>
-        <w:tab/>
-        <w:t>Using the multi-meter in resistance mode, check between TP</w:t>
-      </w:r>
-      <w:r>
-        <w:t>33</w:t>
-      </w:r>
-      <w:r>
-        <w:t xml:space="preserve"> (STP_</w:t>
-      </w:r>
-      <w:r>
-        <w:t>MS2</w:t>
-      </w:r>
-      <w:r>
-        <w:t>) and TP7 (GND) and verify that the resistance is greater than 5KΩ.</w:t>
-      </w:r>
-    </w:p>
-    <w:p>
-      <w:pPr>
-        <w:pStyle w:val="BodyText"/>
-      </w:pPr>
-    </w:p>
-    <w:p>
-      <w:pPr>
-        <w:pStyle w:val="BodyText"/>
-        <w:rPr>
-          <w:sz w:val="28"/>
-          <w:szCs w:val="28"/>
-        </w:rPr>
-      </w:pPr>
-      <w:r>
-        <w:t>TS2-005</w:t>
-      </w:r>
-      <w:r>
-        <w:t>8</w:t>
-      </w:r>
-      <w:r>
-        <w:t>:</w:t>
-      </w:r>
-    </w:p>
-    <w:p>
-      <w:pPr>
-        <w:pStyle w:val="BodyText"/>
-      </w:pPr>
-      <w:r>
-        <w:tab/>
-        <w:t>Using the multi-meter in resistance mode, check between TP</w:t>
-      </w:r>
-      <w:r>
-        <w:t>34</w:t>
-      </w:r>
-      <w:r>
-        <w:t xml:space="preserve"> (STP_</w:t>
-      </w:r>
-      <w:r>
-        <w:t>FLT</w:t>
-      </w:r>
-      <w:r>
-        <w:t>) and TP7 (GND) and verify that the resistance is greater than 5KΩ.</w:t>
-      </w:r>
-    </w:p>
-    <w:p>
-      <w:pPr>
-        <w:pStyle w:val="BodyText"/>
-      </w:pPr>
-    </w:p>
-    <w:p>
-      <w:pPr>
-        <w:pStyle w:val="BodyText"/>
-        <w:rPr>
-          <w:sz w:val="28"/>
-          <w:szCs w:val="28"/>
-        </w:rPr>
-      </w:pPr>
-      <w:r>
-        <w:t>TS2-005</w:t>
-      </w:r>
-      <w:r>
-        <w:t>9</w:t>
-      </w:r>
-      <w:r>
-        <w:t>:</w:t>
-      </w:r>
-    </w:p>
-    <w:p>
-      <w:pPr>
-        <w:pStyle w:val="BodyText"/>
-      </w:pPr>
-      <w:r>
-        <w:tab/>
-        <w:t>Using the multi-meter in resistance mode, check between TP</w:t>
-      </w:r>
-      <w:r>
-        <w:t>35</w:t>
-      </w:r>
-      <w:r>
-        <w:t xml:space="preserve"> (</w:t>
-      </w:r>
-      <w:r>
-        <w:t>FAN_TACH</w:t>
-      </w:r>
-      <w:r>
-        <w:t>) and TP7 (GND) and verify that the resistance is greater than 5KΩ.</w:t>
-      </w:r>
-    </w:p>
-    <w:p>
-      <w:pPr>
-        <w:pStyle w:val="BodyText"/>
-      </w:pPr>
-    </w:p>
-    <w:p>
-      <w:pPr>
-        <w:pStyle w:val="BodyText"/>
-        <w:rPr>
-          <w:sz w:val="28"/>
-          <w:szCs w:val="28"/>
-        </w:rPr>
-      </w:pPr>
-      <w:r>
-        <w:t>TS2-00</w:t>
-      </w:r>
-      <w:r>
-        <w:t>60</w:t>
-      </w:r>
-      <w:r>
-        <w:t>:</w:t>
-      </w:r>
-    </w:p>
-    <w:p>
-      <w:pPr>
-        <w:pStyle w:val="BodyText"/>
-        <w:rPr>
-          <w:sz w:val="28"/>
-          <w:szCs w:val="28"/>
-        </w:rPr>
-      </w:pPr>
-      <w:r>
-        <w:tab/>
-        <w:t>Using the multi-meter in resistance mode, check between TP</w:t>
-      </w:r>
-      <w:r>
-        <w:t>36</w:t>
-      </w:r>
-      <w:r>
-        <w:t xml:space="preserve"> (</w:t>
-      </w:r>
-      <w:r>
-        <w:t>FAN_PWM</w:t>
-      </w:r>
-      <w:r>
-        <w:t>) and TP7 (GND) and verify that the resistance is greater than 5KΩ.</w:t>
+        <w:t>TS2-0058:</w:t>
+      </w:r>
+    </w:p>
+    <w:p>
+      <w:pPr>
+        <w:pStyle w:val="BodyText"/>
+      </w:pPr>
+      <w:r>
+        <w:tab/>
+        <w:t>Using the multi-meter in resistance mode, check between TP34 (STP_FLT) and TP7 (GND) and verify that the resistance is greater than 5KΩ.</w:t>
+      </w:r>
+    </w:p>
+    <w:p>
+      <w:pPr>
+        <w:pStyle w:val="BodyText"/>
+      </w:pPr>
+    </w:p>
+    <w:p>
+      <w:pPr>
+        <w:pStyle w:val="BodyText"/>
+        <w:rPr>
+          <w:sz w:val="28"/>
+          <w:szCs w:val="28"/>
+        </w:rPr>
+      </w:pPr>
+      <w:r>
+        <w:t>TS2-0059:</w:t>
+      </w:r>
+    </w:p>
+    <w:p>
+      <w:pPr>
+        <w:pStyle w:val="BodyText"/>
+      </w:pPr>
+      <w:r>
+        <w:tab/>
+        <w:t>Using the multi-meter in resistance mode, check between TP35 (FAN_TACH) and TP7 (GND) and verify that the resistance is greater than 5KΩ.</w:t>
+      </w:r>
+    </w:p>
+    <w:p>
+      <w:pPr>
+        <w:pStyle w:val="BodyText"/>
+      </w:pPr>
+    </w:p>
+    <w:p>
+      <w:pPr>
+        <w:pStyle w:val="BodyText"/>
+        <w:rPr>
+          <w:sz w:val="28"/>
+          <w:szCs w:val="28"/>
+        </w:rPr>
+      </w:pPr>
+      <w:r>
+        <w:t>TS2-0060:</w:t>
+      </w:r>
+    </w:p>
+    <w:p>
+      <w:pPr>
+        <w:pStyle w:val="BodyText"/>
+        <w:rPr>
+          <w:sz w:val="28"/>
+          <w:szCs w:val="28"/>
+        </w:rPr>
+      </w:pPr>
+      <w:r>
+        <w:tab/>
+        <w:t>Using the multi-meter in resistance mode, check between TP36 (FAN_PWM) and TP7 (GND) and verify that the resistance is greater than 5KΩ.</w:t>
       </w:r>
     </w:p>
     <w:p>
@@ -3019,8 +2807,6 @@
       </w:pPr>
       <w:r>
         <w:tab/>
-      </w:r>
-      <w:r>
         <w:t xml:space="preserve">This section is to energize the PCB assembly with a low current or low voltage supply </w:t>
       </w:r>
       <w:r>
@@ -3340,7 +3126,15 @@
         <w:pStyle w:val="BodyText"/>
       </w:pPr>
       <w:r>
-        <w:t>If the response is successful, this is a pass condition and verifies that the UART interface is working properly.</w:t>
+        <w:t xml:space="preserve">If the response is successful, this is a pass condition and </w:t>
+      </w:r>
+      <w:proofErr w:type="gramStart"/>
+      <w:r>
+        <w:t>verifies</w:t>
+      </w:r>
+      <w:proofErr w:type="gramEnd"/>
+      <w:r>
+        <w:t xml:space="preserve"> that the UART interface is working properly.</w:t>
       </w:r>
     </w:p>
     <w:p>
@@ -3442,13 +3236,7 @@
         <w:tab/>
       </w:r>
       <w:r>
-        <w:t xml:space="preserve">Connect the #2 wire to CN3 terminal #2. Check the status LED D9 to see if it is flashing. If it is not, press and hold the test button and observe if D9 </w:t>
-      </w:r>
-      <w:r>
-        <w:t>indicates</w:t>
-      </w:r>
-      <w:r>
-        <w:t xml:space="preserve"> a double flash with an interval of 1 second and a delay of 2 seconds. If this test is successful, disconnect the #2 wire from CN3.</w:t>
+        <w:t>Connect the #2 wire to CN3 terminal #2. Check the status LED D9 to see if it is flashing. If it is not, press and hold the test button and observe if D9 indicates a double flash with an interval of 1 second and a delay of 2 seconds. If this test is successful, disconnect the #2 wire from CN3.</w:t>
       </w:r>
     </w:p>
     <w:p>
@@ -3496,13 +3284,7 @@
         <w:tab/>
       </w:r>
       <w:r>
-        <w:t xml:space="preserve">Connect the #2 wire to CN4 terminal #1. Check the status LED D9 to see if it is flashing. If it is not, press and hold the test button and observe if D9 </w:t>
-      </w:r>
-      <w:r>
-        <w:t>indicates</w:t>
-      </w:r>
-      <w:r>
-        <w:t xml:space="preserve"> a quadruple flash with an interval of 1 second and a delay of 2 seconds. If this test is successful, disconnect the #2 wire from CN4.</w:t>
+        <w:t>Connect the #2 wire to CN4 terminal #1. Check the status LED D9 to see if it is flashing. If it is not, press and hold the test button and observe if D9 indicates a quadruple flash with an interval of 1 second and a delay of 2 seconds. If this test is successful, disconnect the #2 wire from CN4.</w:t>
       </w:r>
     </w:p>
     <w:p>
@@ -3527,13 +3309,7 @@
         <w:tab/>
       </w:r>
       <w:r>
-        <w:t xml:space="preserve">Connect the #2 wire to CN4 terminal #2. Check the status LED D9 to see if it is flashing. If it is not, press and hold the test button and observe if D9 </w:t>
-      </w:r>
-      <w:r>
-        <w:t>indicates</w:t>
-      </w:r>
-      <w:r>
-        <w:t xml:space="preserve"> a series of five flashes with an interval of 1 second and a delay of 2 seconds. If this test is successful, disconnect the #2 wire from CN4.</w:t>
+        <w:t>Connect the #2 wire to CN4 terminal #2. Check the status LED D9 to see if it is flashing. If it is not, press and hold the test button and observe if D9 indicates a series of five flashes with an interval of 1 second and a delay of 2 seconds. If this test is successful, disconnect the #2 wire from CN4.</w:t>
       </w:r>
     </w:p>
     <w:p>
@@ -3669,13 +3445,69 @@
         <w:tab/>
       </w:r>
       <w:r>
-        <w:t>With the bench top power supply enabled, flash the `FANTEST` firmware to the ESP32 and then disable the bench top power supply output and connect a `FANDC5V40x40 Assembly` to CN6 and then re-enable the power output of the supply. The fan should not be operating. Connect the USB to FTDI converter to J4 observing proper polarity. Load up PuTTY or a similar terminal emulator application and connect to the ESP32 serial console with the following settings: Baud rate 115200, 8 data bits, 1 stop, no parity. Reset the PCB assembly by pressing and releasing the `ENABLE` button. A message should appear on the terminal screen that reads `P1012202501 Assembly Fan Test`. After this message, type in the command `getspeed` (all one word). The system should return 0 indicating that the fan is not rotating as it should not be. Type in the command and argument `setspeed 30`. The fan should start rotating at this point at a slow speed. Type in the command `getspeed` and the system should return a value in RPM. This value will fluctuate depending on</w:t>
+        <w:t>With the bench top power supply enabled, flash the `FANTEST` firmware to the ESP32 and then disable the bench top power supply output and connect a `FANDC5V40x40 Assembly` to CN6 and then re-enable the power output of the supply. The fan should not be operating. Connect the USB to FTDI converter to J4 observing proper polarity. Load up PuTTY or a similar terminal emulator application and connect to the ESP32 serial console with the following settings: Baud rate 115200, 8 data bits, 1 stop, no parity. Reset the PCB assembly by pressing and releasing the `ENABLE` button. A message should appear on the terminal screen that reads `P1012202501 Assembly Fan Test`. After this message, type in the command `</w:t>
+      </w:r>
+      <w:proofErr w:type="spellStart"/>
+      <w:r>
+        <w:t>getspeed</w:t>
+      </w:r>
+      <w:proofErr w:type="spellEnd"/>
+      <w:r>
+        <w:t>` (all one word). The system should return 0 indicating that the fan is not rotating as it should not be. Type in the command and argument `</w:t>
+      </w:r>
+      <w:proofErr w:type="spellStart"/>
+      <w:r>
+        <w:t>setspeed</w:t>
+      </w:r>
+      <w:proofErr w:type="spellEnd"/>
+      <w:r>
+        <w:t xml:space="preserve"> 30`. The fan should start rotating at this point at a slow speed. Type in the command `</w:t>
+      </w:r>
+      <w:proofErr w:type="spellStart"/>
+      <w:r>
+        <w:t>getspeed</w:t>
+      </w:r>
+      <w:proofErr w:type="spellEnd"/>
+      <w:r>
+        <w:t>` and the system should return a value in RPM. This value will fluctuate depending on</w:t>
       </w:r>
       <w:r>
         <w:t xml:space="preserve"> </w:t>
       </w:r>
       <w:r>
-        <w:t>the tolerance of the detection circuitry in the fan and other variables that are outside of our control. Observe the fan for 1 minute to verify that it will continually operate properly. Type in the command `setspeed 100` and observe if the fan speeds up. Type in the command `getspeed` and the system should return an RPM value higher than the prior speed level. Observe the fan for 1 minute to verify proper operation. Type in the command `setspeed 0` and observe if the fan stops rotating. Type in the command `getspeed` and the returned value should be 0. Observe the fan for 1 minute to verify that it does not start rotating without any input. Record the results of this test into the log file. Disable the bench top power supply and disconnect the fan assembly from CN6.</w:t>
+        <w:t>the tolerance of the detection circuitry in the fan and other variables that are outside of our control. Observe the fan for 1 minute to verify that it will continually operate properly. Type in the command `</w:t>
+      </w:r>
+      <w:proofErr w:type="spellStart"/>
+      <w:r>
+        <w:t>setspeed</w:t>
+      </w:r>
+      <w:proofErr w:type="spellEnd"/>
+      <w:r>
+        <w:t xml:space="preserve"> 100` and observe if the fan speeds up. Type in the command `</w:t>
+      </w:r>
+      <w:proofErr w:type="spellStart"/>
+      <w:r>
+        <w:t>getspeed</w:t>
+      </w:r>
+      <w:proofErr w:type="spellEnd"/>
+      <w:r>
+        <w:t>` and the system should return an RPM value higher than the prior speed level. Observe the fan for 1 minute to verify proper operation. Type in the command `</w:t>
+      </w:r>
+      <w:proofErr w:type="spellStart"/>
+      <w:r>
+        <w:t>setspeed</w:t>
+      </w:r>
+      <w:proofErr w:type="spellEnd"/>
+      <w:r>
+        <w:t xml:space="preserve"> 0` and observe if the fan stops rotating. Type in the command `</w:t>
+      </w:r>
+      <w:proofErr w:type="spellStart"/>
+      <w:r>
+        <w:t>getspeed</w:t>
+      </w:r>
+      <w:proofErr w:type="spellEnd"/>
+      <w:r>
+        <w:t>` and the returned value should be 0. Observe the fan for 1 minute to verify that it does not start rotating without any input. Record the results of this test into the log file. Disable the bench top power supply and disconnect the fan assembly from CN6.</w:t>
       </w:r>
     </w:p>
     <w:p>
@@ -3703,7 +3535,31 @@
       </w:r>
       <w:r>
         <w:lastRenderedPageBreak/>
-        <w:t>the terminal software for the following message: `P1012202501 Temperature Sensor Test`. At this point, type the command `gettemp` and press enter, the system should return the current measured temperature in °C that is closely aligned with a desktop thermometer within a few degrees. Set the temperature of the hot air gun to a low setting `that does not burn you` and apply the hot air to the PCB temperature sensor IC7 and hold for 30 seconds. Turn off the hot air gun and then type the command `gettemp` and the ESP32 should return with a temperature value higher than the prior test. Allow the PCB assembly to cool for 5 minutes and then type the command `gettemp` and the ESP32 should respond with a value closer to desktop thermometer.</w:t>
+        <w:t>the terminal software for the following message: `P1012202501 Temperature Sensor Test`. At this point, type the command `</w:t>
+      </w:r>
+      <w:proofErr w:type="spellStart"/>
+      <w:r>
+        <w:t>gettemp</w:t>
+      </w:r>
+      <w:proofErr w:type="spellEnd"/>
+      <w:r>
+        <w:t>` and press enter, the system should return the current measured temperature in °C that is closely aligned with a desktop thermometer within a few degrees. Set the temperature of the hot air gun to a low setting `that does not burn you` and apply the hot air to the PCB temperature sensor IC7 and hold for 30 seconds. Turn off the hot air gun and then type the command `</w:t>
+      </w:r>
+      <w:proofErr w:type="spellStart"/>
+      <w:r>
+        <w:t>gettemp</w:t>
+      </w:r>
+      <w:proofErr w:type="spellEnd"/>
+      <w:r>
+        <w:t>` and the ESP32 should return with a temperature value higher than the prior test. Allow the PCB assembly to cool for 5 minutes and then type the command `</w:t>
+      </w:r>
+      <w:proofErr w:type="spellStart"/>
+      <w:r>
+        <w:t>gettemp</w:t>
+      </w:r>
+      <w:proofErr w:type="spellEnd"/>
+      <w:r>
+        <w:t>` and the ESP32 should respond with a value closer to desktop thermometer.</w:t>
       </w:r>
     </w:p>
     <w:p>
@@ -3860,10 +3716,7 @@
         <w:t>Reconnect the oscilloscope probe to TP2 (5.0V) and move the red lead from the resistor box to TP2 (5.0V).</w:t>
       </w:r>
       <w:r>
-        <w:t xml:space="preserve"> Verify that the oscilloscope is set to the proper voltage range. </w:t>
-      </w:r>
-      <w:r>
-        <w:t>Enable the power supply output and start decreasing the resistance by slowly rotating the dial counterclockwise until the display shows 2A current draw. Verify that the ripple is less than 20mV. Disable the power supply output and reset the resistance box to the highest resistance value.</w:t>
+        <w:t xml:space="preserve"> Verify that the oscilloscope is set to the proper voltage range. Enable the power supply output and start decreasing the resistance by slowly rotating the dial counterclockwise until the display shows 2A current draw. Verify that the ripple is less than 20mV. Disable the power supply output and reset the resistance box to the highest resistance value.</w:t>
       </w:r>
     </w:p>
     <w:p>
@@ -4159,7 +4012,14 @@
     </w:r>
     <w:r>
       <w:tab/>
-      <w:t>DATE: 2/28/2026</w:t>
+    </w:r>
+    <w:proofErr w:type="gramStart"/>
+    <w:r>
+      <w:t>DATE</w:t>
+    </w:r>
+    <w:proofErr w:type="gramEnd"/>
+    <w:r>
+      <w:t>: 2/28/2026</w:t>
     </w:r>
   </w:p>
 </w:hdr>
@@ -4195,7 +4055,14 @@
     </w:r>
     <w:r>
       <w:tab/>
-      <w:t>DATE: 2/28/2026</w:t>
+    </w:r>
+    <w:proofErr w:type="gramStart"/>
+    <w:r>
+      <w:t>DATE</w:t>
+    </w:r>
+    <w:proofErr w:type="gramEnd"/>
+    <w:r>
+      <w:t>: 2/28/2026</w:t>
     </w:r>
   </w:p>
 </w:hdr>
@@ -5046,6 +4913,7 @@
   <w:style w:type="character" w:default="1" w:styleId="DefaultParagraphFont">
     <w:name w:val="Default Paragraph Font"/>
     <w:uiPriority w:val="1"/>
+    <w:semiHidden/>
     <w:unhideWhenUsed/>
   </w:style>
   <w:style w:type="table" w:default="1" w:styleId="TableNormal">

</xml_diff>